<commit_message>
Add ELI5 plain-English section to Concept_Review
Appends a full ELI5 guide covering all 9 lecture topics — AI basics,
BFS/DFS/UCS/Greedy/A*, KB agents, local search, CSP/games, ML,
neural networks, deep learning, and Bayesian networks — each explained
in simple terms with tables, memory hooks, and exam tips. Ends with a
30-second calculation recipe cheat sheet for every question type.

Co-Authored-By: Claude Sonnet 4.6 <noreply@anthropic.com>
</commit_message>
<xml_diff>
--- a/COMP4431_Concept_Review.docx
+++ b/COMP4431_Concept_Review.docx
@@ -7497,6 +7497,4715 @@
         </w:rPr>
         <w:t>For entropy: precompute −p·log₂(p) using the reference values in Calculation Steps</w:t>
       </w:r>
+    </w:p>
+    <w:p>
+      <w:r>
+        <w:br w:type="page"/>
+      </w:r>
+    </w:p>
+    <w:p>
+      <w:pPr>
+        <w:pStyle w:val="Title"/>
+        <w:jc w:val="center"/>
+      </w:pPr>
+      <w:r>
+        <w:t>ELI5 — Plain English Guide to Everything</w:t>
+      </w:r>
+    </w:p>
+    <w:p>
+      <w:pPr>
+        <w:jc w:val="center"/>
+      </w:pPr>
+      <w:r>
+        <w:rPr>
+          <w:b/>
+          <w:color w:val="1F497D"/>
+        </w:rPr>
+        <w:t>Every topic in the course, explained like you are five years old</w:t>
+      </w:r>
+    </w:p>
+    <w:p>
+      <w:r>
+        <w:br w:type="page"/>
+      </w:r>
+    </w:p>
+    <w:p>
+      <w:pPr>
+        <w:pStyle w:val="Heading1"/>
+      </w:pPr>
+      <w:r>
+        <w:rPr>
+          <w:color w:val="1F497D"/>
+        </w:rPr>
+        <w:t>L01 — What is AI?</w:t>
+      </w:r>
+    </w:p>
+    <w:p>
+      <w:pPr>
+        <w:spacing w:after="40"/>
+        <w:ind w:left="0"/>
+      </w:pPr>
+      <w:r>
+        <w:rPr>
+          <w:b/>
+          <w:sz w:val="20"/>
+        </w:rPr>
+        <w:t>AI — You teach a computer to do smart things instead of telling it every single step.</w:t>
+      </w:r>
+    </w:p>
+    <w:p>
+      <w:pPr>
+        <w:spacing w:after="0"/>
+      </w:pPr>
+    </w:p>
+    <w:p>
+      <w:pPr>
+        <w:pStyle w:val="Heading2"/>
+      </w:pPr>
+      <w:r>
+        <w:rPr>
+          <w:color w:val="2E74B5"/>
+        </w:rPr>
+        <w:t>Agent</w:t>
+      </w:r>
+    </w:p>
+    <w:p>
+      <w:pPr>
+        <w:spacing w:after="40"/>
+        <w:ind w:left="0"/>
+      </w:pPr>
+      <w:r>
+        <w:rPr>
+          <w:b w:val="0"/>
+          <w:sz w:val="20"/>
+        </w:rPr>
+        <w:t>Any thing that looks at the world and decides what to do. A thermostat is a dumb agent. ChatGPT is a smart one.</w:t>
+      </w:r>
+    </w:p>
+    <w:p>
+      <w:pPr>
+        <w:spacing w:after="0"/>
+      </w:pPr>
+    </w:p>
+    <w:p>
+      <w:pPr>
+        <w:pStyle w:val="Heading2"/>
+      </w:pPr>
+      <w:r>
+        <w:rPr>
+          <w:color w:val="2E74B5"/>
+        </w:rPr>
+        <w:t>Discriminative vs Generative AI</w:t>
+      </w:r>
+    </w:p>
+    <w:tbl>
+      <w:tblPr>
+        <w:tblStyle w:val="TableGrid"/>
+        <w:tblW w:type="auto" w:w="0"/>
+        <w:tblLook w:firstColumn="1" w:firstRow="1" w:lastColumn="0" w:lastRow="0" w:noHBand="0" w:noVBand="1" w:val="04A0"/>
+      </w:tblPr>
+      <w:tblGrid>
+        <w:gridCol w:w="2493"/>
+        <w:gridCol w:w="2493"/>
+        <w:gridCol w:w="2493"/>
+        <w:gridCol w:w="2493"/>
+      </w:tblGrid>
+      <w:tr>
+        <w:tc>
+          <w:tcPr>
+            <w:tcW w:type="dxa" w:w="1872"/>
+            <w:shd w:fill="D6E4F0" w:val="clear"/>
+          </w:tcPr>
+          <w:p>
+            <w:r>
+              <w:rPr>
+                <w:b/>
+                <w:sz w:val="18"/>
+              </w:rPr>
+              <w:t>Type</w:t>
+            </w:r>
+          </w:p>
+        </w:tc>
+        <w:tc>
+          <w:tcPr>
+            <w:tcW w:type="dxa" w:w="2592"/>
+            <w:shd w:fill="D6E4F0" w:val="clear"/>
+          </w:tcPr>
+          <w:p>
+            <w:r>
+              <w:rPr>
+                <w:b/>
+                <w:sz w:val="18"/>
+              </w:rPr>
+              <w:t>What it learns</w:t>
+            </w:r>
+          </w:p>
+        </w:tc>
+        <w:tc>
+          <w:tcPr>
+            <w:tcW w:type="dxa" w:w="3168"/>
+            <w:shd w:fill="D6E4F0" w:val="clear"/>
+          </w:tcPr>
+          <w:p>
+            <w:r>
+              <w:rPr>
+                <w:b/>
+                <w:sz w:val="18"/>
+              </w:rPr>
+              <w:t>Analogy</w:t>
+            </w:r>
+          </w:p>
+        </w:tc>
+        <w:tc>
+          <w:tcPr>
+            <w:tcW w:type="dxa" w:w="2448"/>
+            <w:shd w:fill="D6E4F0" w:val="clear"/>
+          </w:tcPr>
+          <w:p>
+            <w:r>
+              <w:rPr>
+                <w:b/>
+                <w:sz w:val="18"/>
+              </w:rPr>
+              <w:t>Examples</w:t>
+            </w:r>
+          </w:p>
+        </w:tc>
+      </w:tr>
+      <w:tr>
+        <w:tc>
+          <w:tcPr>
+            <w:tcW w:type="dxa" w:w="1872"/>
+          </w:tcPr>
+          <w:p>
+            <w:r>
+              <w:rPr>
+                <w:sz w:val="18"/>
+              </w:rPr>
+              <w:t>Discriminative</w:t>
+            </w:r>
+          </w:p>
+        </w:tc>
+        <w:tc>
+          <w:tcPr>
+            <w:tcW w:type="dxa" w:w="2592"/>
+          </w:tcPr>
+          <w:p>
+            <w:r>
+              <w:rPr>
+                <w:sz w:val="18"/>
+              </w:rPr>
+              <w:t>The border between things — P(Y|X)</w:t>
+            </w:r>
+          </w:p>
+        </w:tc>
+        <w:tc>
+          <w:tcPr>
+            <w:tcW w:type="dxa" w:w="3168"/>
+          </w:tcPr>
+          <w:p>
+            <w:r>
+              <w:rPr>
+                <w:sz w:val="18"/>
+              </w:rPr>
+              <w:t>Learns the fence between cats and dogs</w:t>
+            </w:r>
+          </w:p>
+        </w:tc>
+        <w:tc>
+          <w:tcPr>
+            <w:tcW w:type="dxa" w:w="2448"/>
+          </w:tcPr>
+          <w:p>
+            <w:r>
+              <w:rPr>
+                <w:sz w:val="18"/>
+              </w:rPr>
+              <w:t>SVM, logistic regression, CNN</w:t>
+            </w:r>
+          </w:p>
+        </w:tc>
+      </w:tr>
+      <w:tr>
+        <w:tc>
+          <w:tcPr>
+            <w:tcW w:type="dxa" w:w="1872"/>
+          </w:tcPr>
+          <w:p>
+            <w:r>
+              <w:rPr>
+                <w:sz w:val="18"/>
+              </w:rPr>
+              <w:t>Generative</w:t>
+            </w:r>
+          </w:p>
+        </w:tc>
+        <w:tc>
+          <w:tcPr>
+            <w:tcW w:type="dxa" w:w="2592"/>
+          </w:tcPr>
+          <w:p>
+            <w:r>
+              <w:rPr>
+                <w:sz w:val="18"/>
+              </w:rPr>
+              <w:t>What things look like — P(X) or P(X,Y)</w:t>
+            </w:r>
+          </w:p>
+        </w:tc>
+        <w:tc>
+          <w:tcPr>
+            <w:tcW w:type="dxa" w:w="3168"/>
+          </w:tcPr>
+          <w:p>
+            <w:r>
+              <w:rPr>
+                <w:sz w:val="18"/>
+              </w:rPr>
+              <w:t>Learns what a cat looks like to draw a new one</w:t>
+            </w:r>
+          </w:p>
+        </w:tc>
+        <w:tc>
+          <w:tcPr>
+            <w:tcW w:type="dxa" w:w="2448"/>
+          </w:tcPr>
+          <w:p>
+            <w:r>
+              <w:rPr>
+                <w:sz w:val="18"/>
+              </w:rPr>
+              <w:t>GAN, VAE, Naive Bayes</w:t>
+            </w:r>
+          </w:p>
+        </w:tc>
+      </w:tr>
+    </w:tbl>
+    <w:p>
+      <w:pPr>
+        <w:spacing w:after="0"/>
+      </w:pPr>
+    </w:p>
+    <w:p>
+      <w:pPr>
+        <w:spacing w:after="40"/>
+        <w:ind w:left="240"/>
+      </w:pPr>
+      <w:r>
+        <w:rPr>
+          <w:b/>
+          <w:color w:val="C05500"/>
+          <w:sz w:val="20"/>
+        </w:rPr>
+        <w:t xml:space="preserve">EXAM TIP: </w:t>
+      </w:r>
+      <w:r>
+        <w:rPr>
+          <w:color w:val="C05500"/>
+          <w:sz w:val="20"/>
+        </w:rPr>
+        <w:t>Exam often asks for one example of each. GAN = generative. SVM = discriminative.</w:t>
+      </w:r>
+    </w:p>
+    <w:p>
+      <w:pPr>
+        <w:spacing w:after="0"/>
+      </w:pPr>
+    </w:p>
+    <w:p>
+      <w:pPr>
+        <w:pStyle w:val="Heading1"/>
+      </w:pPr>
+      <w:r>
+        <w:rPr>
+          <w:color w:val="1F497D"/>
+        </w:rPr>
+        <w:t>L02 — Finding Paths (Search Algorithms)</w:t>
+      </w:r>
+    </w:p>
+    <w:p>
+      <w:pPr>
+        <w:spacing w:after="40"/>
+        <w:ind w:left="0"/>
+      </w:pPr>
+      <w:r>
+        <w:rPr>
+          <w:b/>
+          <w:sz w:val="20"/>
+        </w:rPr>
+        <w:t>Imagine you are in a maze trying to find the exit.</w:t>
+      </w:r>
+    </w:p>
+    <w:p>
+      <w:pPr>
+        <w:spacing w:after="0"/>
+      </w:pPr>
+    </w:p>
+    <w:p>
+      <w:pPr>
+        <w:pStyle w:val="Heading2"/>
+      </w:pPr>
+      <w:r>
+        <w:rPr>
+          <w:color w:val="2E74B5"/>
+        </w:rPr>
+        <w:t>BFS — Breadth-First Search</w:t>
+      </w:r>
+    </w:p>
+    <w:p>
+      <w:pPr>
+        <w:spacing w:after="40"/>
+        <w:ind w:left="0"/>
+      </w:pPr>
+      <w:r>
+        <w:rPr>
+          <w:b w:val="0"/>
+          <w:sz w:val="20"/>
+        </w:rPr>
+        <w:t>Try every door on floor 1 before going to floor 2. Finds the exit with the fewest doors. Ignores corridor length.</w:t>
+      </w:r>
+    </w:p>
+    <w:p>
+      <w:pPr>
+        <w:spacing w:after="40"/>
+        <w:ind w:left="240"/>
+      </w:pPr>
+      <w:r>
+        <w:rPr>
+          <w:b/>
+          <w:color w:val="378643"/>
+          <w:sz w:val="20"/>
+        </w:rPr>
+        <w:t xml:space="preserve">MEMORY: </w:t>
+      </w:r>
+      <w:r>
+        <w:rPr>
+          <w:color w:val="378643"/>
+          <w:sz w:val="20"/>
+        </w:rPr>
+        <w:t>BFS = flood outward in rings. Fewest hops, not cheapest cost.</w:t>
+      </w:r>
+    </w:p>
+    <w:p>
+      <w:pPr>
+        <w:spacing w:after="0"/>
+      </w:pPr>
+    </w:p>
+    <w:p>
+      <w:pPr>
+        <w:pStyle w:val="Heading2"/>
+      </w:pPr>
+      <w:r>
+        <w:rPr>
+          <w:color w:val="2E74B5"/>
+        </w:rPr>
+        <w:t>DFS — Depth-First Search</w:t>
+      </w:r>
+    </w:p>
+    <w:p>
+      <w:pPr>
+        <w:spacing w:after="40"/>
+        <w:ind w:left="0"/>
+      </w:pPr>
+      <w:r>
+        <w:rPr>
+          <w:b w:val="0"/>
+          <w:sz w:val="20"/>
+        </w:rPr>
+        <w:t>Pick one corridor, run all the way to the end, backtrack only when stuck. Fast but might take a terrible long route.</w:t>
+      </w:r>
+    </w:p>
+    <w:p>
+      <w:pPr>
+        <w:spacing w:after="40"/>
+        <w:ind w:left="240"/>
+      </w:pPr>
+      <w:r>
+        <w:rPr>
+          <w:b/>
+          <w:color w:val="378643"/>
+          <w:sz w:val="20"/>
+        </w:rPr>
+        <w:t xml:space="preserve">MEMORY: </w:t>
+      </w:r>
+      <w:r>
+        <w:rPr>
+          <w:color w:val="378643"/>
+          <w:sz w:val="20"/>
+        </w:rPr>
+        <w:t>DFS = go deep first, worry later.</w:t>
+      </w:r>
+    </w:p>
+    <w:p>
+      <w:pPr>
+        <w:spacing w:after="0"/>
+      </w:pPr>
+    </w:p>
+    <w:p>
+      <w:pPr>
+        <w:pStyle w:val="Heading2"/>
+      </w:pPr>
+      <w:r>
+        <w:rPr>
+          <w:color w:val="2E74B5"/>
+        </w:rPr>
+        <w:t>UCS — Uniform Cost Search</w:t>
+      </w:r>
+    </w:p>
+    <w:p>
+      <w:pPr>
+        <w:spacing w:after="40"/>
+        <w:ind w:left="0"/>
+      </w:pPr>
+      <w:r>
+        <w:rPr>
+          <w:b w:val="0"/>
+          <w:sz w:val="20"/>
+        </w:rPr>
+        <w:t>Like BFS but you care about corridor length. Always expand the cheapest path so far. Finds the cheapest total route.</w:t>
+      </w:r>
+    </w:p>
+    <w:p>
+      <w:pPr>
+        <w:spacing w:after="40"/>
+        <w:ind w:left="240"/>
+      </w:pPr>
+      <w:r>
+        <w:rPr>
+          <w:b/>
+          <w:color w:val="378643"/>
+          <w:sz w:val="20"/>
+        </w:rPr>
+        <w:t xml:space="preserve">MEMORY: </w:t>
+      </w:r>
+      <w:r>
+        <w:rPr>
+          <w:color w:val="378643"/>
+          <w:sz w:val="20"/>
+        </w:rPr>
+        <w:t>UCS = BFS but with a price tag on each step.</w:t>
+      </w:r>
+    </w:p>
+    <w:p>
+      <w:pPr>
+        <w:spacing w:after="0"/>
+      </w:pPr>
+    </w:p>
+    <w:p>
+      <w:pPr>
+        <w:pStyle w:val="Heading2"/>
+      </w:pPr>
+      <w:r>
+        <w:rPr>
+          <w:color w:val="2E74B5"/>
+        </w:rPr>
+        <w:t>Greedy Search</w:t>
+      </w:r>
+    </w:p>
+    <w:p>
+      <w:pPr>
+        <w:spacing w:after="40"/>
+        <w:ind w:left="0"/>
+      </w:pPr>
+      <w:r>
+        <w:rPr>
+          <w:b w:val="0"/>
+          <w:sz w:val="20"/>
+        </w:rPr>
+        <w:t>Always walk toward wherever smells most like the exit (your heuristic h). Fast but can walk into dead ends because it ignores how far you have already walked.</w:t>
+      </w:r>
+    </w:p>
+    <w:p>
+      <w:pPr>
+        <w:spacing w:after="0"/>
+      </w:pPr>
+    </w:p>
+    <w:p>
+      <w:pPr>
+        <w:pStyle w:val="Heading2"/>
+      </w:pPr>
+      <w:r>
+        <w:rPr>
+          <w:color w:val="2E74B5"/>
+        </w:rPr>
+        <w:t>A* Search</w:t>
+      </w:r>
+    </w:p>
+    <w:p>
+      <w:pPr>
+        <w:spacing w:after="40"/>
+        <w:ind w:left="0"/>
+      </w:pPr>
+      <w:r>
+        <w:rPr>
+          <w:b w:val="0"/>
+          <w:sz w:val="20"/>
+        </w:rPr>
+        <w:t>Best of both: f = g + h. g = actual distance walked so far. h = estimated distance left.</w:t>
+      </w:r>
+    </w:p>
+    <w:p>
+      <w:pPr>
+        <w:pStyle w:val="ListBullet"/>
+        <w:spacing w:after="20"/>
+        <w:ind w:left="0"/>
+      </w:pPr>
+      <w:r>
+        <w:rPr>
+          <w:sz w:val="20"/>
+        </w:rPr>
+        <w:t>Always expand the node with the lowest f.</w:t>
+      </w:r>
+    </w:p>
+    <w:p>
+      <w:pPr>
+        <w:pStyle w:val="ListBullet"/>
+        <w:spacing w:after="20"/>
+        <w:ind w:left="0"/>
+      </w:pPr>
+      <w:r>
+        <w:rPr>
+          <w:sz w:val="20"/>
+        </w:rPr>
+        <w:t>Guaranteed to find the cheapest route if h never overestimates (admissible).</w:t>
+      </w:r>
+    </w:p>
+    <w:p>
+      <w:pPr>
+        <w:pStyle w:val="ListBullet"/>
+        <w:spacing w:after="20"/>
+        <w:ind w:left="0"/>
+      </w:pPr>
+      <w:r>
+        <w:rPr>
+          <w:sz w:val="20"/>
+        </w:rPr>
+        <w:t>Update a node if you find a cheaper route to it mid-search.</w:t>
+      </w:r>
+    </w:p>
+    <w:p>
+      <w:pPr>
+        <w:spacing w:after="40"/>
+        <w:ind w:left="240"/>
+      </w:pPr>
+      <w:r>
+        <w:rPr>
+          <w:b/>
+          <w:color w:val="378643"/>
+          <w:sz w:val="20"/>
+        </w:rPr>
+        <w:t xml:space="preserve">MEMORY: </w:t>
+      </w:r>
+      <w:r>
+        <w:rPr>
+          <w:color w:val="378643"/>
+          <w:sz w:val="20"/>
+        </w:rPr>
+        <w:t>A* = UCS + a smart smell detector. Never lies about how far the exit is.</w:t>
+      </w:r>
+    </w:p>
+    <w:p>
+      <w:pPr>
+        <w:spacing w:after="0"/>
+      </w:pPr>
+    </w:p>
+    <w:p>
+      <w:pPr>
+        <w:pStyle w:val="Heading2"/>
+      </w:pPr>
+      <w:r>
+        <w:rPr>
+          <w:color w:val="2E74B5"/>
+        </w:rPr>
+        <w:t>Admissible Heuristic</w:t>
+      </w:r>
+    </w:p>
+    <w:p>
+      <w:pPr>
+        <w:spacing w:after="40"/>
+        <w:ind w:left="0"/>
+      </w:pPr>
+      <w:r>
+        <w:rPr>
+          <w:b w:val="0"/>
+          <w:sz w:val="20"/>
+        </w:rPr>
+        <w:t>Your estimate of distance to the exit is never too high. It can be lower than reality (optimistic) but never higher. This is what makes A* always find the best path.</w:t>
+      </w:r>
+    </w:p>
+    <w:p>
+      <w:pPr>
+        <w:spacing w:after="40"/>
+        <w:ind w:left="240"/>
+      </w:pPr>
+      <w:r>
+        <w:rPr>
+          <w:b/>
+          <w:color w:val="C05500"/>
+          <w:sz w:val="20"/>
+        </w:rPr>
+        <w:t xml:space="preserve">EXAM TIP: </w:t>
+      </w:r>
+      <w:r>
+        <w:rPr>
+          <w:color w:val="C05500"/>
+          <w:sz w:val="20"/>
+        </w:rPr>
+        <w:t>Misplaced tiles: admissible. Manhattan distance: admissible and dominates misplaced tiles.</w:t>
+      </w:r>
+    </w:p>
+    <w:p>
+      <w:pPr>
+        <w:spacing w:after="0"/>
+      </w:pPr>
+    </w:p>
+    <w:p>
+      <w:pPr>
+        <w:pStyle w:val="Heading2"/>
+      </w:pPr>
+      <w:r>
+        <w:rPr>
+          <w:color w:val="2E74B5"/>
+        </w:rPr>
+        <w:t>Dominant Heuristic</w:t>
+      </w:r>
+    </w:p>
+    <w:p>
+      <w:pPr>
+        <w:spacing w:after="40"/>
+        <w:ind w:left="0"/>
+      </w:pPr>
+      <w:r>
+        <w:rPr>
+          <w:b w:val="0"/>
+          <w:sz w:val="20"/>
+        </w:rPr>
+        <w:t>Between two admissible estimates, the bigger one is better (closer to truth = more informed). Bigger estimate = fewer wrong doors explored.</w:t>
+      </w:r>
+    </w:p>
+    <w:p>
+      <w:pPr>
+        <w:spacing w:after="0"/>
+      </w:pPr>
+    </w:p>
+    <w:p>
+      <w:pPr>
+        <w:pStyle w:val="Heading1"/>
+      </w:pPr>
+      <w:r>
+        <w:rPr>
+          <w:color w:val="1F497D"/>
+        </w:rPr>
+        <w:t>L03 — Rules and Logic (KB Agents)</w:t>
+      </w:r>
+    </w:p>
+    <w:p>
+      <w:pPr>
+        <w:spacing w:after="40"/>
+        <w:ind w:left="0"/>
+      </w:pPr>
+      <w:r>
+        <w:rPr>
+          <w:b/>
+          <w:sz w:val="20"/>
+        </w:rPr>
+        <w:t>Imagine a detective with a notebook of facts and rules.</w:t>
+      </w:r>
+    </w:p>
+    <w:p>
+      <w:pPr>
+        <w:spacing w:after="0"/>
+      </w:pPr>
+    </w:p>
+    <w:p>
+      <w:pPr>
+        <w:pStyle w:val="Heading2"/>
+      </w:pPr>
+      <w:r>
+        <w:rPr>
+          <w:color w:val="2E74B5"/>
+        </w:rPr>
+        <w:t>Forward Chaining</w:t>
+      </w:r>
+    </w:p>
+    <w:p>
+      <w:pPr>
+        <w:spacing w:after="40"/>
+        <w:ind w:left="0"/>
+      </w:pPr>
+      <w:r>
+        <w:rPr>
+          <w:b w:val="0"/>
+          <w:sz w:val="20"/>
+        </w:rPr>
+        <w:t>Start from clues you have. Apply rules. Write down new conclusions. Repeat until goal proved or no more rules fire.</w:t>
+      </w:r>
+    </w:p>
+    <w:p>
+      <w:pPr>
+        <w:pStyle w:val="ListBullet"/>
+        <w:spacing w:after="20"/>
+        <w:ind w:left="0"/>
+      </w:pPr>
+      <w:r>
+        <w:rPr>
+          <w:sz w:val="20"/>
+        </w:rPr>
+        <w:t>Direction: facts → conclusions (bottom-up, data-driven).</w:t>
+      </w:r>
+    </w:p>
+    <w:p>
+      <w:pPr>
+        <w:pStyle w:val="ListBullet"/>
+        <w:spacing w:after="20"/>
+        <w:ind w:left="0"/>
+      </w:pPr>
+      <w:r>
+        <w:rPr>
+          <w:sz w:val="20"/>
+        </w:rPr>
+        <w:t>Example: wet_grass → it_rained → umbrella_was_used.</w:t>
+      </w:r>
+    </w:p>
+    <w:p>
+      <w:pPr>
+        <w:pStyle w:val="ListBullet"/>
+        <w:spacing w:after="20"/>
+        <w:ind w:left="0"/>
+      </w:pPr>
+      <w:r>
+        <w:rPr>
+          <w:sz w:val="20"/>
+        </w:rPr>
+        <w:t>Good when: many queries needed, or you want all consequences.</w:t>
+      </w:r>
+    </w:p>
+    <w:p>
+      <w:pPr>
+        <w:spacing w:after="0"/>
+      </w:pPr>
+    </w:p>
+    <w:p>
+      <w:pPr>
+        <w:pStyle w:val="Heading2"/>
+      </w:pPr>
+      <w:r>
+        <w:rPr>
+          <w:color w:val="2E74B5"/>
+        </w:rPr>
+        <w:t>Backward Chaining</w:t>
+      </w:r>
+    </w:p>
+    <w:p>
+      <w:pPr>
+        <w:spacing w:after="40"/>
+        <w:ind w:left="0"/>
+      </w:pPr>
+      <w:r>
+        <w:rPr>
+          <w:b w:val="0"/>
+          <w:sz w:val="20"/>
+        </w:rPr>
+        <w:t>Start from what you want to prove. Work backwards to see if the premises can be satisfied.</w:t>
+      </w:r>
+    </w:p>
+    <w:p>
+      <w:pPr>
+        <w:pStyle w:val="ListBullet"/>
+        <w:spacing w:after="20"/>
+        <w:ind w:left="0"/>
+      </w:pPr>
+      <w:r>
+        <w:rPr>
+          <w:sz w:val="20"/>
+        </w:rPr>
+        <w:t>Direction: goal → premises (top-down, goal-driven).</w:t>
+      </w:r>
+    </w:p>
+    <w:p>
+      <w:pPr>
+        <w:pStyle w:val="ListBullet"/>
+        <w:spacing w:after="20"/>
+        <w:ind w:left="0"/>
+      </w:pPr>
+      <w:r>
+        <w:rPr>
+          <w:sz w:val="20"/>
+        </w:rPr>
+        <w:t>Example: Did it rain? → Was the grass wet? → Yes. Done.</w:t>
+      </w:r>
+    </w:p>
+    <w:p>
+      <w:pPr>
+        <w:pStyle w:val="ListBullet"/>
+        <w:spacing w:after="20"/>
+        <w:ind w:left="0"/>
+      </w:pPr>
+      <w:r>
+        <w:rPr>
+          <w:sz w:val="20"/>
+        </w:rPr>
+        <w:t>Good when: single specific goal, avoids irrelevant rules.</w:t>
+      </w:r>
+    </w:p>
+    <w:p>
+      <w:pPr>
+        <w:spacing w:after="40"/>
+        <w:ind w:left="240"/>
+      </w:pPr>
+      <w:r>
+        <w:rPr>
+          <w:b/>
+          <w:color w:val="378643"/>
+          <w:sz w:val="20"/>
+        </w:rPr>
+        <w:t xml:space="preserve">MEMORY: </w:t>
+      </w:r>
+      <w:r>
+        <w:rPr>
+          <w:color w:val="378643"/>
+          <w:sz w:val="20"/>
+        </w:rPr>
+        <w:t>FC = start from facts and go forward. BC = start from the answer and go backward.</w:t>
+      </w:r>
+    </w:p>
+    <w:p>
+      <w:pPr>
+        <w:spacing w:after="0"/>
+      </w:pPr>
+    </w:p>
+    <w:p>
+      <w:pPr>
+        <w:pStyle w:val="Heading1"/>
+      </w:pPr>
+      <w:r>
+        <w:rPr>
+          <w:color w:val="1F497D"/>
+        </w:rPr>
+        <w:t>L04 — Local Search</w:t>
+      </w:r>
+    </w:p>
+    <w:p>
+      <w:pPr>
+        <w:spacing w:after="40"/>
+        <w:ind w:left="0"/>
+      </w:pPr>
+      <w:r>
+        <w:rPr>
+          <w:b/>
+          <w:sz w:val="20"/>
+        </w:rPr>
+        <w:t>You are lost on a hilly landscape. The highest peak is the best solution.</w:t>
+      </w:r>
+    </w:p>
+    <w:p>
+      <w:pPr>
+        <w:spacing w:after="0"/>
+      </w:pPr>
+    </w:p>
+    <w:p>
+      <w:pPr>
+        <w:pStyle w:val="Heading2"/>
+      </w:pPr>
+      <w:r>
+        <w:rPr>
+          <w:color w:val="2E74B5"/>
+        </w:rPr>
+        <w:t>Hill Climbing</w:t>
+      </w:r>
+    </w:p>
+    <w:p>
+      <w:pPr>
+        <w:spacing w:after="40"/>
+        <w:ind w:left="0"/>
+      </w:pPr>
+      <w:r>
+        <w:rPr>
+          <w:b w:val="0"/>
+          <w:sz w:val="20"/>
+        </w:rPr>
+        <w:t>Always take a step in the direction that goes uphill. Problem: you get stuck on small hills (local optima) and cannot see the big mountain.</w:t>
+      </w:r>
+    </w:p>
+    <w:p>
+      <w:pPr>
+        <w:spacing w:after="0"/>
+      </w:pPr>
+    </w:p>
+    <w:p>
+      <w:pPr>
+        <w:pStyle w:val="Heading2"/>
+      </w:pPr>
+      <w:r>
+        <w:rPr>
+          <w:color w:val="2E74B5"/>
+        </w:rPr>
+        <w:t>Simulated Annealing (SA)</w:t>
+      </w:r>
+    </w:p>
+    <w:p>
+      <w:pPr>
+        <w:spacing w:after="40"/>
+        <w:ind w:left="0"/>
+      </w:pPr>
+      <w:r>
+        <w:rPr>
+          <w:b w:val="0"/>
+          <w:sz w:val="20"/>
+        </w:rPr>
+        <w:t>Mostly step uphill, but sometimes randomly step down (accept a worse answer).</w:t>
+      </w:r>
+    </w:p>
+    <w:p>
+      <w:pPr>
+        <w:pStyle w:val="ListBullet"/>
+        <w:spacing w:after="20"/>
+        <w:ind w:left="0"/>
+      </w:pPr>
+      <w:r>
+        <w:rPr>
+          <w:sz w:val="20"/>
+        </w:rPr>
+        <w:t>Early on (temperature T is HIGH) you wander a lot — accept bad moves freely.</w:t>
+      </w:r>
+    </w:p>
+    <w:p>
+      <w:pPr>
+        <w:pStyle w:val="ListBullet"/>
+        <w:spacing w:after="20"/>
+        <w:ind w:left="0"/>
+      </w:pPr>
+      <w:r>
+        <w:rPr>
+          <w:sz w:val="20"/>
+        </w:rPr>
+        <w:t>Later (T is LOW) you mostly go uphill — rarely accept bad moves.</w:t>
+      </w:r>
+    </w:p>
+    <w:p>
+      <w:pPr>
+        <w:pStyle w:val="ListBullet"/>
+        <w:spacing w:after="20"/>
+        <w:ind w:left="0"/>
+      </w:pPr>
+      <w:r>
+        <w:rPr>
+          <w:sz w:val="20"/>
+        </w:rPr>
+        <w:t>This lets you escape local optima and find the true peak.</w:t>
+      </w:r>
+    </w:p>
+    <w:p>
+      <w:pPr>
+        <w:spacing w:after="0"/>
+      </w:pPr>
+    </w:p>
+    <w:p>
+      <w:pPr>
+        <w:spacing w:after="40"/>
+        <w:ind w:left="0"/>
+      </w:pPr>
+      <w:r>
+        <w:rPr>
+          <w:b w:val="0"/>
+          <w:sz w:val="20"/>
+        </w:rPr>
+        <w:t>Acceptance probability for a WORSE move:</w:t>
+      </w:r>
+    </w:p>
+    <w:p>
+      <w:pPr>
+        <w:spacing w:after="40"/>
+        <w:ind w:left="320"/>
+      </w:pPr>
+      <w:r>
+        <w:rPr>
+          <w:rFonts w:ascii="Courier New" w:hAnsi="Courier New"/>
+          <w:b/>
+          <w:sz w:val="20"/>
+        </w:rPr>
+        <w:t>P = e^{-|delta_cost| / T}</w:t>
+      </w:r>
+    </w:p>
+    <w:p>
+      <w:pPr>
+        <w:pStyle w:val="ListBullet"/>
+        <w:spacing w:after="20"/>
+        <w:ind w:left="0"/>
+      </w:pPr>
+      <w:r>
+        <w:rPr>
+          <w:sz w:val="20"/>
+        </w:rPr>
+        <w:t>T big -&gt; P close to 1 -&gt; almost always accept (wandering phase).</w:t>
+      </w:r>
+    </w:p>
+    <w:p>
+      <w:pPr>
+        <w:pStyle w:val="ListBullet"/>
+        <w:spacing w:after="20"/>
+        <w:ind w:left="0"/>
+      </w:pPr>
+      <w:r>
+        <w:rPr>
+          <w:sz w:val="20"/>
+        </w:rPr>
+        <w:t>T tiny -&gt; P close to 0 -&gt; almost never accept (converging phase).</w:t>
+      </w:r>
+    </w:p>
+    <w:p>
+      <w:pPr>
+        <w:pStyle w:val="ListBullet"/>
+        <w:spacing w:after="20"/>
+        <w:ind w:left="0"/>
+      </w:pPr>
+      <w:r>
+        <w:rPr>
+          <w:sz w:val="20"/>
+        </w:rPr>
+        <w:t>Better move -&gt; ALWAYS accept (probability = 1, no calculation needed).</w:t>
+      </w:r>
+    </w:p>
+    <w:p>
+      <w:pPr>
+        <w:spacing w:after="40"/>
+        <w:ind w:left="240"/>
+      </w:pPr>
+      <w:r>
+        <w:rPr>
+          <w:b/>
+          <w:color w:val="C05500"/>
+          <w:sz w:val="20"/>
+        </w:rPr>
+        <w:t xml:space="preserve">EXAM TIP: </w:t>
+      </w:r>
+      <w:r>
+        <w:rPr>
+          <w:color w:val="C05500"/>
+          <w:sz w:val="20"/>
+        </w:rPr>
+        <w:t>Three sign conventions all give the same P = e^{-1/T}. Safe formula: always use |delta_cost| in numerator.</w:t>
+      </w:r>
+    </w:p>
+    <w:p>
+      <w:pPr>
+        <w:spacing w:after="0"/>
+      </w:pPr>
+    </w:p>
+    <w:p>
+      <w:pPr>
+        <w:pStyle w:val="Heading2"/>
+      </w:pPr>
+      <w:r>
+        <w:rPr>
+          <w:color w:val="2E74B5"/>
+        </w:rPr>
+        <w:t>Genetic Algorithm (GA)</w:t>
+      </w:r>
+    </w:p>
+    <w:p>
+      <w:pPr>
+        <w:spacing w:after="40"/>
+        <w:ind w:left="0"/>
+      </w:pPr>
+      <w:r>
+        <w:rPr>
+          <w:b w:val="0"/>
+          <w:sz w:val="20"/>
+        </w:rPr>
+        <w:t>Have 100 possible answers (population). The good ones breed (crossover). Random mutations flip bits. Bad ones die. Repeat. It is evolution.</w:t>
+      </w:r>
+    </w:p>
+    <w:tbl>
+      <w:tblPr>
+        <w:tblStyle w:val="TableGrid"/>
+        <w:tblW w:type="auto" w:w="0"/>
+        <w:tblLook w:firstColumn="1" w:firstRow="1" w:lastColumn="0" w:lastRow="0" w:noHBand="0" w:noVBand="1" w:val="04A0"/>
+      </w:tblPr>
+      <w:tblGrid>
+        <w:gridCol w:w="4986"/>
+        <w:gridCol w:w="4986"/>
+      </w:tblGrid>
+      <w:tr>
+        <w:tc>
+          <w:tcPr>
+            <w:tcW w:type="dxa" w:w="2160"/>
+            <w:shd w:fill="D6E4F0" w:val="clear"/>
+          </w:tcPr>
+          <w:p>
+            <w:r>
+              <w:rPr>
+                <w:b/>
+                <w:sz w:val="18"/>
+              </w:rPr>
+              <w:t>Step</w:t>
+            </w:r>
+          </w:p>
+        </w:tc>
+        <w:tc>
+          <w:tcPr>
+            <w:tcW w:type="dxa" w:w="7200"/>
+            <w:shd w:fill="D6E4F0" w:val="clear"/>
+          </w:tcPr>
+          <w:p>
+            <w:r>
+              <w:rPr>
+                <w:b/>
+                <w:sz w:val="18"/>
+              </w:rPr>
+              <w:t>Plain English</w:t>
+            </w:r>
+          </w:p>
+        </w:tc>
+      </w:tr>
+      <w:tr>
+        <w:tc>
+          <w:tcPr>
+            <w:tcW w:type="dxa" w:w="2160"/>
+          </w:tcPr>
+          <w:p>
+            <w:r>
+              <w:rPr>
+                <w:sz w:val="18"/>
+              </w:rPr>
+              <w:t>Representation</w:t>
+            </w:r>
+          </w:p>
+        </w:tc>
+        <w:tc>
+          <w:tcPr>
+            <w:tcW w:type="dxa" w:w="7200"/>
+          </w:tcPr>
+          <w:p>
+            <w:r>
+              <w:rPr>
+                <w:sz w:val="18"/>
+              </w:rPr>
+              <w:t>Each answer is a binary string. For feature selection: 1000-bit string, 1=use this feature, 0=skip it.</w:t>
+            </w:r>
+          </w:p>
+        </w:tc>
+      </w:tr>
+      <w:tr>
+        <w:tc>
+          <w:tcPr>
+            <w:tcW w:type="dxa" w:w="2160"/>
+          </w:tcPr>
+          <w:p>
+            <w:r>
+              <w:rPr>
+                <w:sz w:val="18"/>
+              </w:rPr>
+              <w:t>Fitness</w:t>
+            </w:r>
+          </w:p>
+        </w:tc>
+        <w:tc>
+          <w:tcPr>
+            <w:tcW w:type="dxa" w:w="7200"/>
+          </w:tcPr>
+          <w:p>
+            <w:r>
+              <w:rPr>
+                <w:sz w:val="18"/>
+              </w:rPr>
+              <w:t>How good is this answer? For feature selection: train SVM on chosen features, fitness = validation accuracy.</w:t>
+            </w:r>
+          </w:p>
+        </w:tc>
+      </w:tr>
+      <w:tr>
+        <w:tc>
+          <w:tcPr>
+            <w:tcW w:type="dxa" w:w="2160"/>
+          </w:tcPr>
+          <w:p>
+            <w:r>
+              <w:rPr>
+                <w:sz w:val="18"/>
+              </w:rPr>
+              <w:t>Selection</w:t>
+            </w:r>
+          </w:p>
+        </w:tc>
+        <w:tc>
+          <w:tcPr>
+            <w:tcW w:type="dxa" w:w="7200"/>
+          </w:tcPr>
+          <w:p>
+            <w:r>
+              <w:rPr>
+                <w:sz w:val="18"/>
+              </w:rPr>
+              <w:t>Better answers are more likely to become parents (roulette wheel or tournament).</w:t>
+            </w:r>
+          </w:p>
+        </w:tc>
+      </w:tr>
+      <w:tr>
+        <w:tc>
+          <w:tcPr>
+            <w:tcW w:type="dxa" w:w="2160"/>
+          </w:tcPr>
+          <w:p>
+            <w:r>
+              <w:rPr>
+                <w:sz w:val="18"/>
+              </w:rPr>
+              <w:t>Crossover</w:t>
+            </w:r>
+          </w:p>
+        </w:tc>
+        <w:tc>
+          <w:tcPr>
+            <w:tcW w:type="dxa" w:w="7200"/>
+          </w:tcPr>
+          <w:p>
+            <w:r>
+              <w:rPr>
+                <w:sz w:val="18"/>
+              </w:rPr>
+              <w:t>Swap a portion of two parents to make children. Mix the good bits together.</w:t>
+            </w:r>
+          </w:p>
+        </w:tc>
+      </w:tr>
+      <w:tr>
+        <w:tc>
+          <w:tcPr>
+            <w:tcW w:type="dxa" w:w="2160"/>
+          </w:tcPr>
+          <w:p>
+            <w:r>
+              <w:rPr>
+                <w:sz w:val="18"/>
+              </w:rPr>
+              <w:t>Mutation</w:t>
+            </w:r>
+          </w:p>
+        </w:tc>
+        <w:tc>
+          <w:tcPr>
+            <w:tcW w:type="dxa" w:w="7200"/>
+          </w:tcPr>
+          <w:p>
+            <w:r>
+              <w:rPr>
+                <w:sz w:val="18"/>
+              </w:rPr>
+              <w:t>Randomly flip a few bits. Keeps variety, prevents getting stuck.</w:t>
+            </w:r>
+          </w:p>
+        </w:tc>
+      </w:tr>
+      <w:tr>
+        <w:tc>
+          <w:tcPr>
+            <w:tcW w:type="dxa" w:w="2160"/>
+          </w:tcPr>
+          <w:p>
+            <w:r>
+              <w:rPr>
+                <w:sz w:val="18"/>
+              </w:rPr>
+              <w:t>Termination</w:t>
+            </w:r>
+          </w:p>
+        </w:tc>
+        <w:tc>
+          <w:tcPr>
+            <w:tcW w:type="dxa" w:w="7200"/>
+          </w:tcPr>
+          <w:p>
+            <w:r>
+              <w:rPr>
+                <w:sz w:val="18"/>
+              </w:rPr>
+              <w:t>Stop after max generations, or when fitness stops improving.</w:t>
+            </w:r>
+          </w:p>
+        </w:tc>
+      </w:tr>
+    </w:tbl>
+    <w:p>
+      <w:pPr>
+        <w:spacing w:after="0"/>
+      </w:pPr>
+    </w:p>
+    <w:p>
+      <w:pPr>
+        <w:spacing w:after="0"/>
+      </w:pPr>
+    </w:p>
+    <w:p>
+      <w:pPr>
+        <w:pStyle w:val="Heading1"/>
+      </w:pPr>
+      <w:r>
+        <w:rPr>
+          <w:color w:val="1F497D"/>
+        </w:rPr>
+        <w:t>L05 — Constraints and Games</w:t>
+      </w:r>
+    </w:p>
+    <w:p>
+      <w:pPr>
+        <w:pStyle w:val="Heading2"/>
+      </w:pPr>
+      <w:r>
+        <w:rPr>
+          <w:color w:val="2E74B5"/>
+        </w:rPr>
+        <w:t>CSP — Constraint Satisfaction Problem</w:t>
+      </w:r>
+    </w:p>
+    <w:p>
+      <w:pPr>
+        <w:spacing w:after="40"/>
+        <w:ind w:left="0"/>
+      </w:pPr>
+      <w:r>
+        <w:rPr>
+          <w:b w:val="0"/>
+          <w:sz w:val="20"/>
+        </w:rPr>
+        <w:t>Colouring a map so no two touching countries share a colour.</w:t>
+      </w:r>
+    </w:p>
+    <w:p>
+      <w:pPr>
+        <w:pStyle w:val="ListBullet"/>
+        <w:spacing w:after="20"/>
+        <w:ind w:left="0"/>
+      </w:pPr>
+      <w:r>
+        <w:rPr>
+          <w:sz w:val="20"/>
+        </w:rPr>
+        <w:t>Variables = countries to colour.</w:t>
+      </w:r>
+    </w:p>
+    <w:p>
+      <w:pPr>
+        <w:pStyle w:val="ListBullet"/>
+        <w:spacing w:after="20"/>
+        <w:ind w:left="0"/>
+      </w:pPr>
+      <w:r>
+        <w:rPr>
+          <w:sz w:val="20"/>
+        </w:rPr>
+        <w:t>Domains = available colours.</w:t>
+      </w:r>
+    </w:p>
+    <w:p>
+      <w:pPr>
+        <w:pStyle w:val="ListBullet"/>
+        <w:spacing w:after="20"/>
+        <w:ind w:left="0"/>
+      </w:pPr>
+      <w:r>
+        <w:rPr>
+          <w:sz w:val="20"/>
+        </w:rPr>
+        <w:t>Constraints = neighbouring countries must differ.</w:t>
+      </w:r>
+    </w:p>
+    <w:p>
+      <w:pPr>
+        <w:spacing w:after="0"/>
+      </w:pPr>
+    </w:p>
+    <w:p>
+      <w:pPr>
+        <w:pStyle w:val="Heading2"/>
+      </w:pPr>
+      <w:r>
+        <w:rPr>
+          <w:color w:val="2E74B5"/>
+        </w:rPr>
+        <w:t>MCV — Most Constrained Variable</w:t>
+      </w:r>
+    </w:p>
+    <w:p>
+      <w:pPr>
+        <w:spacing w:after="40"/>
+        <w:ind w:left="0"/>
+      </w:pPr>
+      <w:r>
+        <w:rPr>
+          <w:b w:val="0"/>
+          <w:sz w:val="20"/>
+        </w:rPr>
+        <w:t>Which country to colour next? Pick the one with the fewest legal colours left. Catches dead-ends early before you waste time.</w:t>
+      </w:r>
+    </w:p>
+    <w:p>
+      <w:pPr>
+        <w:spacing w:after="0"/>
+      </w:pPr>
+    </w:p>
+    <w:p>
+      <w:pPr>
+        <w:pStyle w:val="Heading2"/>
+      </w:pPr>
+      <w:r>
+        <w:rPr>
+          <w:color w:val="2E74B5"/>
+        </w:rPr>
+        <w:t>LCV — Least Constraining Value</w:t>
+      </w:r>
+    </w:p>
+    <w:p>
+      <w:pPr>
+        <w:spacing w:after="40"/>
+        <w:ind w:left="0"/>
+      </w:pPr>
+      <w:r>
+        <w:rPr>
+          <w:b w:val="0"/>
+          <w:sz w:val="20"/>
+        </w:rPr>
+        <w:t>Which colour to use for the chosen country? Pick the colour that blocks the fewest choices for your neighbours. Keeps your options open.</w:t>
+      </w:r>
+    </w:p>
+    <w:p>
+      <w:pPr>
+        <w:spacing w:after="40"/>
+        <w:ind w:left="240"/>
+      </w:pPr>
+      <w:r>
+        <w:rPr>
+          <w:b/>
+          <w:color w:val="378643"/>
+          <w:sz w:val="20"/>
+        </w:rPr>
+        <w:t xml:space="preserve">MEMORY: </w:t>
+      </w:r>
+      <w:r>
+        <w:rPr>
+          <w:color w:val="378643"/>
+          <w:sz w:val="20"/>
+        </w:rPr>
+        <w:t>MCV = which VARIABLE to assign next. LCV = which VALUE to give it.</w:t>
+      </w:r>
+    </w:p>
+    <w:p>
+      <w:pPr>
+        <w:spacing w:after="0"/>
+      </w:pPr>
+    </w:p>
+    <w:p>
+      <w:pPr>
+        <w:pStyle w:val="Heading2"/>
+      </w:pPr>
+      <w:r>
+        <w:rPr>
+          <w:color w:val="2E74B5"/>
+        </w:rPr>
+        <w:t>Degree Heuristic</w:t>
+      </w:r>
+    </w:p>
+    <w:p>
+      <w:pPr>
+        <w:spacing w:after="40"/>
+        <w:ind w:left="0"/>
+      </w:pPr>
+      <w:r>
+        <w:rPr>
+          <w:b w:val="0"/>
+          <w:sz w:val="20"/>
+        </w:rPr>
+        <w:t>Tie-break for MCV: pick the variable touching the most other variables. Good starting point before any assignments are made.</w:t>
+      </w:r>
+    </w:p>
+    <w:p>
+      <w:pPr>
+        <w:spacing w:after="0"/>
+      </w:pPr>
+    </w:p>
+    <w:p>
+      <w:pPr>
+        <w:pStyle w:val="Heading2"/>
+      </w:pPr>
+      <w:r>
+        <w:rPr>
+          <w:color w:val="2E74B5"/>
+        </w:rPr>
+        <w:t>Minimax</w:t>
+      </w:r>
+    </w:p>
+    <w:p>
+      <w:pPr>
+        <w:spacing w:after="40"/>
+        <w:ind w:left="0"/>
+      </w:pPr>
+      <w:r>
+        <w:rPr>
+          <w:b w:val="0"/>
+          <w:sz w:val="20"/>
+        </w:rPr>
+        <w:t>Two-player game tree. MAX picks the move giving the highest score. MIN picks the move giving the lowest score. Each plays perfectly.</w:t>
+      </w:r>
+    </w:p>
+    <w:p>
+      <w:pPr>
+        <w:pStyle w:val="ListBullet"/>
+        <w:spacing w:after="20"/>
+        <w:ind w:left="0"/>
+      </w:pPr>
+      <w:r>
+        <w:rPr>
+          <w:sz w:val="20"/>
+        </w:rPr>
+        <w:t>Evaluate leaves first.</w:t>
+      </w:r>
+    </w:p>
+    <w:p>
+      <w:pPr>
+        <w:pStyle w:val="ListBullet"/>
+        <w:spacing w:after="20"/>
+        <w:ind w:left="0"/>
+      </w:pPr>
+      <w:r>
+        <w:rPr>
+          <w:sz w:val="20"/>
+        </w:rPr>
+        <w:t>Propagate: MIN nodes take the minimum of children; MAX nodes take the maximum.</w:t>
+      </w:r>
+    </w:p>
+    <w:p>
+      <w:pPr>
+        <w:pStyle w:val="ListBullet"/>
+        <w:spacing w:after="20"/>
+        <w:ind w:left="0"/>
+      </w:pPr>
+      <w:r>
+        <w:rPr>
+          <w:sz w:val="20"/>
+        </w:rPr>
+        <w:t>Root tells MAX which first move to make.</w:t>
+      </w:r>
+    </w:p>
+    <w:p>
+      <w:pPr>
+        <w:spacing w:after="0"/>
+      </w:pPr>
+    </w:p>
+    <w:p>
+      <w:pPr>
+        <w:pStyle w:val="Heading2"/>
+      </w:pPr>
+      <w:r>
+        <w:rPr>
+          <w:color w:val="2E74B5"/>
+        </w:rPr>
+        <w:t>Alpha-Beta Pruning</w:t>
+      </w:r>
+    </w:p>
+    <w:p>
+      <w:pPr>
+        <w:spacing w:after="40"/>
+        <w:ind w:left="0"/>
+      </w:pPr>
+      <w:r>
+        <w:rPr>
+          <w:b w:val="0"/>
+          <w:sz w:val="20"/>
+        </w:rPr>
+        <w:t>Play Minimax but skip branches you already know will not affect the result.</w:t>
+      </w:r>
+    </w:p>
+    <w:p>
+      <w:pPr>
+        <w:pStyle w:val="ListBullet"/>
+        <w:spacing w:after="20"/>
+        <w:ind w:left="0"/>
+      </w:pPr>
+      <w:r>
+        <w:rPr>
+          <w:sz w:val="20"/>
+        </w:rPr>
+        <w:t>alpha = best score MAX has found so far. Starts at -infinity.</w:t>
+      </w:r>
+    </w:p>
+    <w:p>
+      <w:pPr>
+        <w:pStyle w:val="ListBullet"/>
+        <w:spacing w:after="20"/>
+        <w:ind w:left="0"/>
+      </w:pPr>
+      <w:r>
+        <w:rPr>
+          <w:sz w:val="20"/>
+        </w:rPr>
+        <w:t>beta = best score MIN has found so far. Starts at +infinity.</w:t>
+      </w:r>
+    </w:p>
+    <w:p>
+      <w:pPr>
+        <w:pStyle w:val="ListBullet"/>
+        <w:spacing w:after="20"/>
+        <w:ind w:left="0"/>
+      </w:pPr>
+      <w:r>
+        <w:rPr>
+          <w:sz w:val="20"/>
+        </w:rPr>
+        <w:t>Prune (skip) when alpha &gt;= beta — the opponent will never allow this branch.</w:t>
+      </w:r>
+    </w:p>
+    <w:p>
+      <w:pPr>
+        <w:spacing w:after="40"/>
+        <w:ind w:left="240"/>
+      </w:pPr>
+      <w:r>
+        <w:rPr>
+          <w:b/>
+          <w:color w:val="378643"/>
+          <w:sz w:val="20"/>
+        </w:rPr>
+        <w:t xml:space="preserve">MEMORY: </w:t>
+      </w:r>
+      <w:r>
+        <w:rPr>
+          <w:color w:val="378643"/>
+          <w:sz w:val="20"/>
+        </w:rPr>
+        <w:t>Alpha-Beta = Minimax with a shortcut. Same answer, fewer calculations.</w:t>
+      </w:r>
+    </w:p>
+    <w:p>
+      <w:pPr>
+        <w:spacing w:after="0"/>
+      </w:pPr>
+    </w:p>
+    <w:p>
+      <w:pPr>
+        <w:pStyle w:val="Heading1"/>
+      </w:pPr>
+      <w:r>
+        <w:rPr>
+          <w:color w:val="1F497D"/>
+        </w:rPr>
+        <w:t>L06 — Machine Learning</w:t>
+      </w:r>
+    </w:p>
+    <w:p>
+      <w:pPr>
+        <w:pStyle w:val="Heading2"/>
+      </w:pPr>
+      <w:r>
+        <w:rPr>
+          <w:color w:val="2E74B5"/>
+        </w:rPr>
+        <w:t>Supervised vs Unsupervised</w:t>
+      </w:r>
+    </w:p>
+    <w:tbl>
+      <w:tblPr>
+        <w:tblStyle w:val="TableGrid"/>
+        <w:tblW w:type="auto" w:w="0"/>
+        <w:tblLook w:firstColumn="1" w:firstRow="1" w:lastColumn="0" w:lastRow="0" w:noHBand="0" w:noVBand="1" w:val="04A0"/>
+      </w:tblPr>
+      <w:tblGrid>
+        <w:gridCol w:w="3324"/>
+        <w:gridCol w:w="3324"/>
+        <w:gridCol w:w="3324"/>
+      </w:tblGrid>
+      <w:tr>
+        <w:tc>
+          <w:tcPr>
+            <w:tcW w:type="dxa" w:w="1872"/>
+            <w:shd w:fill="D6E4F0" w:val="clear"/>
+          </w:tcPr>
+          <w:p>
+            <w:r>
+              <w:rPr>
+                <w:b/>
+                <w:sz w:val="18"/>
+              </w:rPr>
+            </w:r>
+          </w:p>
+        </w:tc>
+        <w:tc>
+          <w:tcPr>
+            <w:tcW w:type="dxa" w:w="4032"/>
+            <w:shd w:fill="D6E4F0" w:val="clear"/>
+          </w:tcPr>
+          <w:p>
+            <w:r>
+              <w:rPr>
+                <w:b/>
+                <w:sz w:val="18"/>
+              </w:rPr>
+              <w:t>Supervised</w:t>
+            </w:r>
+          </w:p>
+        </w:tc>
+        <w:tc>
+          <w:tcPr>
+            <w:tcW w:type="dxa" w:w="4032"/>
+            <w:shd w:fill="D6E4F0" w:val="clear"/>
+          </w:tcPr>
+          <w:p>
+            <w:r>
+              <w:rPr>
+                <w:b/>
+                <w:sz w:val="18"/>
+              </w:rPr>
+              <w:t>Unsupervised</w:t>
+            </w:r>
+          </w:p>
+        </w:tc>
+      </w:tr>
+      <w:tr>
+        <w:tc>
+          <w:tcPr>
+            <w:tcW w:type="dxa" w:w="1872"/>
+          </w:tcPr>
+          <w:p>
+            <w:r>
+              <w:rPr>
+                <w:sz w:val="18"/>
+              </w:rPr>
+              <w:t>Labels</w:t>
+            </w:r>
+          </w:p>
+        </w:tc>
+        <w:tc>
+          <w:tcPr>
+            <w:tcW w:type="dxa" w:w="4032"/>
+          </w:tcPr>
+          <w:p>
+            <w:r>
+              <w:rPr>
+                <w:sz w:val="18"/>
+              </w:rPr>
+              <w:t>Yes — you provide correct answers</w:t>
+            </w:r>
+          </w:p>
+        </w:tc>
+        <w:tc>
+          <w:tcPr>
+            <w:tcW w:type="dxa" w:w="4032"/>
+          </w:tcPr>
+          <w:p>
+            <w:r>
+              <w:rPr>
+                <w:sz w:val="18"/>
+              </w:rPr>
+              <w:t>No — algorithm finds structure itself</w:t>
+            </w:r>
+          </w:p>
+        </w:tc>
+      </w:tr>
+      <w:tr>
+        <w:tc>
+          <w:tcPr>
+            <w:tcW w:type="dxa" w:w="1872"/>
+          </w:tcPr>
+          <w:p>
+            <w:r>
+              <w:rPr>
+                <w:sz w:val="18"/>
+              </w:rPr>
+              <w:t>Goal</w:t>
+            </w:r>
+          </w:p>
+        </w:tc>
+        <w:tc>
+          <w:tcPr>
+            <w:tcW w:type="dxa" w:w="4032"/>
+          </w:tcPr>
+          <w:p>
+            <w:r>
+              <w:rPr>
+                <w:sz w:val="18"/>
+              </w:rPr>
+              <w:t>Learn a mapping from input to output</w:t>
+            </w:r>
+          </w:p>
+        </w:tc>
+        <w:tc>
+          <w:tcPr>
+            <w:tcW w:type="dxa" w:w="4032"/>
+          </w:tcPr>
+          <w:p>
+            <w:r>
+              <w:rPr>
+                <w:sz w:val="18"/>
+              </w:rPr>
+              <w:t>Discover hidden groups or patterns</w:t>
+            </w:r>
+          </w:p>
+        </w:tc>
+      </w:tr>
+      <w:tr>
+        <w:tc>
+          <w:tcPr>
+            <w:tcW w:type="dxa" w:w="1872"/>
+          </w:tcPr>
+          <w:p>
+            <w:r>
+              <w:rPr>
+                <w:sz w:val="18"/>
+              </w:rPr>
+              <w:t>Examples</w:t>
+            </w:r>
+          </w:p>
+        </w:tc>
+        <w:tc>
+          <w:tcPr>
+            <w:tcW w:type="dxa" w:w="4032"/>
+          </w:tcPr>
+          <w:p>
+            <w:r>
+              <w:rPr>
+                <w:sz w:val="18"/>
+              </w:rPr>
+              <w:t>Decision Tree, SVM, Perceptron</w:t>
+            </w:r>
+          </w:p>
+        </w:tc>
+        <w:tc>
+          <w:tcPr>
+            <w:tcW w:type="dxa" w:w="4032"/>
+          </w:tcPr>
+          <w:p>
+            <w:r>
+              <w:rPr>
+                <w:sz w:val="18"/>
+              </w:rPr>
+              <w:t>K-Means</w:t>
+            </w:r>
+          </w:p>
+        </w:tc>
+      </w:tr>
+    </w:tbl>
+    <w:p>
+      <w:pPr>
+        <w:spacing w:after="0"/>
+      </w:pPr>
+    </w:p>
+    <w:p>
+      <w:pPr>
+        <w:spacing w:after="0"/>
+      </w:pPr>
+    </w:p>
+    <w:p>
+      <w:pPr>
+        <w:pStyle w:val="Heading2"/>
+      </w:pPr>
+      <w:r>
+        <w:rPr>
+          <w:color w:val="2E74B5"/>
+        </w:rPr>
+        <w:t>K-Means Clustering</w:t>
+      </w:r>
+    </w:p>
+    <w:p>
+      <w:pPr>
+        <w:spacing w:after="40"/>
+        <w:ind w:left="0"/>
+      </w:pPr>
+      <w:r>
+        <w:rPr>
+          <w:b w:val="0"/>
+          <w:sz w:val="20"/>
+        </w:rPr>
+        <w:t>Put K magnets on the data. Each data point sticks to the nearest magnet. Move each magnet to the centre of its group. Repeat until magnets stop moving.</w:t>
+      </w:r>
+    </w:p>
+    <w:p>
+      <w:pPr>
+        <w:pStyle w:val="ListBullet"/>
+        <w:spacing w:after="20"/>
+        <w:ind w:left="0"/>
+      </w:pPr>
+      <w:r>
+        <w:rPr>
+          <w:sz w:val="20"/>
+        </w:rPr>
+        <w:t>Step 1: initialise K cluster centres (randomly or by given values).</w:t>
+      </w:r>
+    </w:p>
+    <w:p>
+      <w:pPr>
+        <w:pStyle w:val="ListBullet"/>
+        <w:spacing w:after="20"/>
+        <w:ind w:left="0"/>
+      </w:pPr>
+      <w:r>
+        <w:rPr>
+          <w:sz w:val="20"/>
+        </w:rPr>
+        <w:t>Step 2: assign each point to nearest centre by distance.</w:t>
+      </w:r>
+    </w:p>
+    <w:p>
+      <w:pPr>
+        <w:pStyle w:val="ListBullet"/>
+        <w:spacing w:after="20"/>
+        <w:ind w:left="0"/>
+      </w:pPr>
+      <w:r>
+        <w:rPr>
+          <w:sz w:val="20"/>
+        </w:rPr>
+        <w:t>Step 3: recompute each centre as the mean of its assigned points.</w:t>
+      </w:r>
+    </w:p>
+    <w:p>
+      <w:pPr>
+        <w:pStyle w:val="ListBullet"/>
+        <w:spacing w:after="20"/>
+        <w:ind w:left="0"/>
+      </w:pPr>
+      <w:r>
+        <w:rPr>
+          <w:sz w:val="20"/>
+        </w:rPr>
+        <w:t>Step 4: repeat steps 2-3 until assignments do not change.</w:t>
+      </w:r>
+    </w:p>
+    <w:p>
+      <w:pPr>
+        <w:spacing w:after="40"/>
+        <w:ind w:left="240"/>
+      </w:pPr>
+      <w:r>
+        <w:rPr>
+          <w:b/>
+          <w:color w:val="C05500"/>
+          <w:sz w:val="20"/>
+        </w:rPr>
+        <w:t xml:space="preserve">EXAM TIP: </w:t>
+      </w:r>
+      <w:r>
+        <w:rPr>
+          <w:color w:val="C05500"/>
+          <w:sz w:val="20"/>
+        </w:rPr>
+        <w:t>In 1D: distance = |x - centre|. Always show the assignment table in the exam.</w:t>
+      </w:r>
+    </w:p>
+    <w:p>
+      <w:pPr>
+        <w:spacing w:after="0"/>
+      </w:pPr>
+    </w:p>
+    <w:p>
+      <w:pPr>
+        <w:pStyle w:val="Heading2"/>
+      </w:pPr>
+      <w:r>
+        <w:rPr>
+          <w:color w:val="2E74B5"/>
+        </w:rPr>
+        <w:t>Decision Tree</w:t>
+      </w:r>
+    </w:p>
+    <w:p>
+      <w:pPr>
+        <w:spacing w:after="40"/>
+        <w:ind w:left="0"/>
+      </w:pPr>
+      <w:r>
+        <w:rPr>
+          <w:b w:val="0"/>
+          <w:sz w:val="20"/>
+        </w:rPr>
+        <w:t>A game of 20 questions. Is it sunny? Yes -&gt; Is it hot? No -&gt; GO HIKING.</w:t>
+      </w:r>
+    </w:p>
+    <w:p>
+      <w:pPr>
+        <w:pStyle w:val="ListBullet"/>
+        <w:spacing w:after="20"/>
+        <w:ind w:left="0"/>
+      </w:pPr>
+      <w:r>
+        <w:rPr>
+          <w:sz w:val="20"/>
+        </w:rPr>
+        <w:t>At each node: pick the question (feature) that splits the data most cleanly.</w:t>
+      </w:r>
+    </w:p>
+    <w:p>
+      <w:pPr>
+        <w:pStyle w:val="ListBullet"/>
+        <w:spacing w:after="20"/>
+        <w:ind w:left="0"/>
+      </w:pPr>
+      <w:r>
+        <w:rPr>
+          <w:sz w:val="20"/>
+        </w:rPr>
+        <w:t>Entropy H(S) = how mixed-up a group is. All-same = 0. 50/50 = 1.0.</w:t>
+      </w:r>
+    </w:p>
+    <w:p>
+      <w:pPr>
+        <w:pStyle w:val="ListBullet"/>
+        <w:spacing w:after="20"/>
+        <w:ind w:left="0"/>
+      </w:pPr>
+      <w:r>
+        <w:rPr>
+          <w:sz w:val="20"/>
+        </w:rPr>
+        <w:t>Information Gain IG = how much cleaner the groups get after asking the question.</w:t>
+      </w:r>
+    </w:p>
+    <w:p>
+      <w:pPr>
+        <w:pStyle w:val="ListBullet"/>
+        <w:spacing w:after="20"/>
+        <w:ind w:left="0"/>
+      </w:pPr>
+      <w:r>
+        <w:rPr>
+          <w:sz w:val="20"/>
+        </w:rPr>
+        <w:t>Pick the feature with the highest IG as the split. Recurse on each branch.</w:t>
+      </w:r>
+    </w:p>
+    <w:p>
+      <w:pPr>
+        <w:pStyle w:val="ListBullet"/>
+        <w:spacing w:after="20"/>
+        <w:ind w:left="0"/>
+      </w:pPr>
+      <w:r>
+        <w:rPr>
+          <w:sz w:val="20"/>
+        </w:rPr>
+        <w:t>Stop when a branch is pure (entropy = 0) or empty.</w:t>
+      </w:r>
+    </w:p>
+    <w:p>
+      <w:pPr>
+        <w:spacing w:after="0"/>
+      </w:pPr>
+    </w:p>
+    <w:p>
+      <w:pPr>
+        <w:spacing w:after="40"/>
+        <w:ind w:left="320"/>
+      </w:pPr>
+      <w:r>
+        <w:rPr>
+          <w:rFonts w:ascii="Courier New" w:hAnsi="Courier New"/>
+          <w:b/>
+          <w:sz w:val="20"/>
+        </w:rPr>
+        <w:t>H(S) = -sum p*log2(p)     IG(F) = H(S) - sum (|Sv|/|S|)*H(Sv)</w:t>
+      </w:r>
+    </w:p>
+    <w:p>
+      <w:pPr>
+        <w:spacing w:after="0"/>
+      </w:pPr>
+    </w:p>
+    <w:p>
+      <w:pPr>
+        <w:pStyle w:val="Heading2"/>
+      </w:pPr>
+      <w:r>
+        <w:rPr>
+          <w:color w:val="2E74B5"/>
+        </w:rPr>
+        <w:t>SVM — Support Vector Machine</w:t>
+      </w:r>
+    </w:p>
+    <w:p>
+      <w:pPr>
+        <w:spacing w:after="40"/>
+        <w:ind w:left="0"/>
+      </w:pPr>
+      <w:r>
+        <w:rPr>
+          <w:b w:val="0"/>
+          <w:sz w:val="20"/>
+        </w:rPr>
+        <w:t>Draw the widest possible street between two groups of dots. The dots right on the kerb are the support vectors. The street centre line is the decision boundary.</w:t>
+      </w:r>
+    </w:p>
+    <w:p>
+      <w:pPr>
+        <w:pStyle w:val="ListBullet"/>
+        <w:spacing w:after="20"/>
+        <w:ind w:left="0"/>
+      </w:pPr>
+      <w:r>
+        <w:rPr>
+          <w:sz w:val="20"/>
+        </w:rPr>
+        <w:t>Margin = 2 / ||w||. Maximising margin = finding the best separator.</w:t>
+      </w:r>
+    </w:p>
+    <w:p>
+      <w:pPr>
+        <w:pStyle w:val="ListBullet"/>
+        <w:spacing w:after="20"/>
+        <w:ind w:left="0"/>
+      </w:pPr>
+      <w:r>
+        <w:rPr>
+          <w:sz w:val="20"/>
+        </w:rPr>
+        <w:t>Points on the margin: w^T x + b = +-1. Decision boundary: w^T x + b = 0.</w:t>
+      </w:r>
+    </w:p>
+    <w:p>
+      <w:pPr>
+        <w:spacing w:after="40"/>
+        <w:ind w:left="240"/>
+      </w:pPr>
+      <w:r>
+        <w:rPr>
+          <w:b/>
+          <w:color w:val="C05500"/>
+          <w:sz w:val="20"/>
+        </w:rPr>
+        <w:t xml:space="preserve">EXAM TIP: </w:t>
+      </w:r>
+      <w:r>
+        <w:rPr>
+          <w:color w:val="C05500"/>
+          <w:sz w:val="20"/>
+        </w:rPr>
+        <w:t>In the exam: identify which points are on the margin lines (one from each class). Those are your support vectors.</w:t>
+      </w:r>
+    </w:p>
+    <w:p>
+      <w:pPr>
+        <w:spacing w:after="0"/>
+      </w:pPr>
+    </w:p>
+    <w:p>
+      <w:pPr>
+        <w:pStyle w:val="Heading1"/>
+      </w:pPr>
+      <w:r>
+        <w:rPr>
+          <w:color w:val="1F497D"/>
+        </w:rPr>
+        <w:t>L07 — Neural Networks</w:t>
+      </w:r>
+    </w:p>
+    <w:p>
+      <w:pPr>
+        <w:pStyle w:val="Heading2"/>
+      </w:pPr>
+      <w:r>
+        <w:rPr>
+          <w:color w:val="2E74B5"/>
+        </w:rPr>
+        <w:t>Biological vs Artificial Neuron</w:t>
+      </w:r>
+    </w:p>
+    <w:tbl>
+      <w:tblPr>
+        <w:tblStyle w:val="TableGrid"/>
+        <w:tblW w:type="auto" w:w="0"/>
+        <w:tblLook w:firstColumn="1" w:firstRow="1" w:lastColumn="0" w:lastRow="0" w:noHBand="0" w:noVBand="1" w:val="04A0"/>
+      </w:tblPr>
+      <w:tblGrid>
+        <w:gridCol w:w="3324"/>
+        <w:gridCol w:w="3324"/>
+        <w:gridCol w:w="3324"/>
+      </w:tblGrid>
+      <w:tr>
+        <w:tc>
+          <w:tcPr>
+            <w:tcW w:type="dxa" w:w="2592"/>
+            <w:shd w:fill="D6E4F0" w:val="clear"/>
+          </w:tcPr>
+          <w:p>
+            <w:r>
+              <w:rPr>
+                <w:b/>
+                <w:sz w:val="18"/>
+              </w:rPr>
+              <w:t>Biological</w:t>
+            </w:r>
+          </w:p>
+        </w:tc>
+        <w:tc>
+          <w:tcPr>
+            <w:tcW w:type="dxa" w:w="3168"/>
+            <w:shd w:fill="D6E4F0" w:val="clear"/>
+          </w:tcPr>
+          <w:p>
+            <w:r>
+              <w:rPr>
+                <w:b/>
+                <w:sz w:val="18"/>
+              </w:rPr>
+              <w:t>Artificial</w:t>
+            </w:r>
+          </w:p>
+        </w:tc>
+        <w:tc>
+          <w:tcPr>
+            <w:tcW w:type="dxa" w:w="3168"/>
+            <w:shd w:fill="D6E4F0" w:val="clear"/>
+          </w:tcPr>
+          <w:p>
+            <w:r>
+              <w:rPr>
+                <w:b/>
+                <w:sz w:val="18"/>
+              </w:rPr>
+              <w:t>Role</w:t>
+            </w:r>
+          </w:p>
+        </w:tc>
+      </w:tr>
+      <w:tr>
+        <w:tc>
+          <w:tcPr>
+            <w:tcW w:type="dxa" w:w="2592"/>
+          </w:tcPr>
+          <w:p>
+            <w:r>
+              <w:rPr>
+                <w:sz w:val="18"/>
+              </w:rPr>
+              <w:t>Dendrites</w:t>
+            </w:r>
+          </w:p>
+        </w:tc>
+        <w:tc>
+          <w:tcPr>
+            <w:tcW w:type="dxa" w:w="3168"/>
+          </w:tcPr>
+          <w:p>
+            <w:r>
+              <w:rPr>
+                <w:sz w:val="18"/>
+              </w:rPr>
+              <w:t>Inputs x_i</w:t>
+            </w:r>
+          </w:p>
+        </w:tc>
+        <w:tc>
+          <w:tcPr>
+            <w:tcW w:type="dxa" w:w="3168"/>
+          </w:tcPr>
+          <w:p>
+            <w:r>
+              <w:rPr>
+                <w:sz w:val="18"/>
+              </w:rPr>
+              <w:t>Receive incoming signals</w:t>
+            </w:r>
+          </w:p>
+        </w:tc>
+      </w:tr>
+      <w:tr>
+        <w:tc>
+          <w:tcPr>
+            <w:tcW w:type="dxa" w:w="2592"/>
+          </w:tcPr>
+          <w:p>
+            <w:r>
+              <w:rPr>
+                <w:sz w:val="18"/>
+              </w:rPr>
+              <w:t>Synaptic weights</w:t>
+            </w:r>
+          </w:p>
+        </w:tc>
+        <w:tc>
+          <w:tcPr>
+            <w:tcW w:type="dxa" w:w="3168"/>
+          </w:tcPr>
+          <w:p>
+            <w:r>
+              <w:rPr>
+                <w:sz w:val="18"/>
+              </w:rPr>
+              <w:t>Weights w_i</w:t>
+            </w:r>
+          </w:p>
+        </w:tc>
+        <w:tc>
+          <w:tcPr>
+            <w:tcW w:type="dxa" w:w="3168"/>
+          </w:tcPr>
+          <w:p>
+            <w:r>
+              <w:rPr>
+                <w:sz w:val="18"/>
+              </w:rPr>
+              <w:t>Strengthen or weaken connections</w:t>
+            </w:r>
+          </w:p>
+        </w:tc>
+      </w:tr>
+      <w:tr>
+        <w:tc>
+          <w:tcPr>
+            <w:tcW w:type="dxa" w:w="2592"/>
+          </w:tcPr>
+          <w:p>
+            <w:r>
+              <w:rPr>
+                <w:sz w:val="18"/>
+              </w:rPr>
+              <w:t>Soma (cell body)</w:t>
+            </w:r>
+          </w:p>
+        </w:tc>
+        <w:tc>
+          <w:tcPr>
+            <w:tcW w:type="dxa" w:w="3168"/>
+          </w:tcPr>
+          <w:p>
+            <w:r>
+              <w:rPr>
+                <w:sz w:val="18"/>
+              </w:rPr>
+              <w:t>Weighted sum: net = sum(w_i * x_i)</w:t>
+            </w:r>
+          </w:p>
+        </w:tc>
+        <w:tc>
+          <w:tcPr>
+            <w:tcW w:type="dxa" w:w="3168"/>
+          </w:tcPr>
+          <w:p>
+            <w:r>
+              <w:rPr>
+                <w:sz w:val="18"/>
+              </w:rPr>
+              <w:t>Integrate all signals</w:t>
+            </w:r>
+          </w:p>
+        </w:tc>
+      </w:tr>
+      <w:tr>
+        <w:tc>
+          <w:tcPr>
+            <w:tcW w:type="dxa" w:w="2592"/>
+          </w:tcPr>
+          <w:p>
+            <w:r>
+              <w:rPr>
+                <w:sz w:val="18"/>
+              </w:rPr>
+              <w:t>Firing threshold</w:t>
+            </w:r>
+          </w:p>
+        </w:tc>
+        <w:tc>
+          <w:tcPr>
+            <w:tcW w:type="dxa" w:w="3168"/>
+          </w:tcPr>
+          <w:p>
+            <w:r>
+              <w:rPr>
+                <w:sz w:val="18"/>
+              </w:rPr>
+              <w:t>Bias weight w_0</w:t>
+            </w:r>
+          </w:p>
+        </w:tc>
+        <w:tc>
+          <w:tcPr>
+            <w:tcW w:type="dxa" w:w="3168"/>
+          </w:tcPr>
+          <w:p>
+            <w:r>
+              <w:rPr>
+                <w:sz w:val="18"/>
+              </w:rPr>
+              <w:t>Shift the activation threshold</w:t>
+            </w:r>
+          </w:p>
+        </w:tc>
+      </w:tr>
+      <w:tr>
+        <w:tc>
+          <w:tcPr>
+            <w:tcW w:type="dxa" w:w="2592"/>
+          </w:tcPr>
+          <w:p>
+            <w:r>
+              <w:rPr>
+                <w:sz w:val="18"/>
+              </w:rPr>
+              <w:t>Axon</w:t>
+            </w:r>
+          </w:p>
+        </w:tc>
+        <w:tc>
+          <w:tcPr>
+            <w:tcW w:type="dxa" w:w="3168"/>
+          </w:tcPr>
+          <w:p>
+            <w:r>
+              <w:rPr>
+                <w:sz w:val="18"/>
+              </w:rPr>
+              <w:t>Output: o = sigma(net)</w:t>
+            </w:r>
+          </w:p>
+        </w:tc>
+        <w:tc>
+          <w:tcPr>
+            <w:tcW w:type="dxa" w:w="3168"/>
+          </w:tcPr>
+          <w:p>
+            <w:r>
+              <w:rPr>
+                <w:sz w:val="18"/>
+              </w:rPr>
+              <w:t>Transmit result to next layer</w:t>
+            </w:r>
+          </w:p>
+        </w:tc>
+      </w:tr>
+    </w:tbl>
+    <w:p>
+      <w:pPr>
+        <w:spacing w:after="0"/>
+      </w:pPr>
+    </w:p>
+    <w:p>
+      <w:pPr>
+        <w:spacing w:after="0"/>
+      </w:pPr>
+    </w:p>
+    <w:p>
+      <w:pPr>
+        <w:pStyle w:val="Heading2"/>
+      </w:pPr>
+      <w:r>
+        <w:rPr>
+          <w:color w:val="2E74B5"/>
+        </w:rPr>
+        <w:t>Sigmoid Activation</w:t>
+      </w:r>
+    </w:p>
+    <w:p>
+      <w:pPr>
+        <w:spacing w:after="40"/>
+        <w:ind w:left="0"/>
+      </w:pPr>
+      <w:r>
+        <w:rPr>
+          <w:b w:val="0"/>
+          <w:sz w:val="20"/>
+        </w:rPr>
+        <w:t>Squishes any number into (0, 1). Looks like an S-curve.</w:t>
+      </w:r>
+    </w:p>
+    <w:p>
+      <w:pPr>
+        <w:spacing w:after="40"/>
+        <w:ind w:left="320"/>
+      </w:pPr>
+      <w:r>
+        <w:rPr>
+          <w:rFonts w:ascii="Courier New" w:hAnsi="Courier New"/>
+          <w:b/>
+          <w:sz w:val="20"/>
+        </w:rPr>
+        <w:t>sigma(x) = 1/(1+e^{-x})     sigma'(x) = sigma(x)*(1-sigma(x))</w:t>
+      </w:r>
+    </w:p>
+    <w:p>
+      <w:pPr>
+        <w:spacing w:after="40"/>
+        <w:ind w:left="240"/>
+      </w:pPr>
+      <w:r>
+        <w:rPr>
+          <w:b w:val="0"/>
+          <w:sz w:val="20"/>
+        </w:rPr>
+        <w:t>Derivative is never zero -&gt; gradients can always flow back through. This is why we use sigmoid, not the sign function.</w:t>
+      </w:r>
+    </w:p>
+    <w:p>
+      <w:pPr>
+        <w:spacing w:after="0"/>
+      </w:pPr>
+    </w:p>
+    <w:p>
+      <w:pPr>
+        <w:pStyle w:val="Heading2"/>
+      </w:pPr>
+      <w:r>
+        <w:rPr>
+          <w:color w:val="2E74B5"/>
+        </w:rPr>
+        <w:t>Why Sign Function Cannot Be Used in Backprop</w:t>
+      </w:r>
+    </w:p>
+    <w:p>
+      <w:pPr>
+        <w:pStyle w:val="ListBullet"/>
+        <w:spacing w:after="20"/>
+        <w:ind w:left="0"/>
+      </w:pPr>
+      <w:r>
+        <w:rPr>
+          <w:sz w:val="20"/>
+        </w:rPr>
+        <w:t>Sign function derivative = 0 everywhere (except undefined at x=0).</w:t>
+      </w:r>
+    </w:p>
+    <w:p>
+      <w:pPr>
+        <w:pStyle w:val="ListBullet"/>
+        <w:spacing w:after="20"/>
+        <w:ind w:left="0"/>
+      </w:pPr>
+      <w:r>
+        <w:rPr>
+          <w:sz w:val="20"/>
+        </w:rPr>
+        <w:t>Backprop needs the gradient at every neuron to update weights.</w:t>
+      </w:r>
+    </w:p>
+    <w:p>
+      <w:pPr>
+        <w:pStyle w:val="ListBullet"/>
+        <w:spacing w:after="20"/>
+        <w:ind w:left="0"/>
+      </w:pPr>
+      <w:r>
+        <w:rPr>
+          <w:sz w:val="20"/>
+        </w:rPr>
+        <w:t>Zero gradient -&gt; no information on which way to nudge weights -&gt; network cannot learn.</w:t>
+      </w:r>
+    </w:p>
+    <w:p>
+      <w:pPr>
+        <w:pStyle w:val="ListBullet"/>
+        <w:spacing w:after="20"/>
+        <w:ind w:left="0"/>
+      </w:pPr>
+      <w:r>
+        <w:rPr>
+          <w:sz w:val="20"/>
+        </w:rPr>
+        <w:t>Sigmoid has non-zero derivative everywhere -&gt; gradient flows -&gt; learning works.</w:t>
+      </w:r>
+    </w:p>
+    <w:p>
+      <w:pPr>
+        <w:spacing w:after="0"/>
+      </w:pPr>
+    </w:p>
+    <w:p>
+      <w:pPr>
+        <w:pStyle w:val="Heading2"/>
+      </w:pPr>
+      <w:r>
+        <w:rPr>
+          <w:color w:val="2E74B5"/>
+        </w:rPr>
+        <w:t>Perceptron</w:t>
+      </w:r>
+    </w:p>
+    <w:p>
+      <w:pPr>
+        <w:spacing w:after="40"/>
+        <w:ind w:left="0"/>
+      </w:pPr>
+      <w:r>
+        <w:rPr>
+          <w:b w:val="0"/>
+          <w:sz w:val="20"/>
+        </w:rPr>
+        <w:t>One neuron. Binary classification only. If it guesses wrong, nudge every weight:</w:t>
+      </w:r>
+    </w:p>
+    <w:p>
+      <w:pPr>
+        <w:spacing w:after="40"/>
+        <w:ind w:left="320"/>
+      </w:pPr>
+      <w:r>
+        <w:rPr>
+          <w:rFonts w:ascii="Courier New" w:hAnsi="Courier New"/>
+          <w:b/>
+          <w:sz w:val="20"/>
+        </w:rPr>
+        <w:t>w_new = w_old + eta * (y - y_hat) * x</w:t>
+      </w:r>
+    </w:p>
+    <w:p>
+      <w:pPr>
+        <w:spacing w:after="40"/>
+        <w:ind w:left="240"/>
+      </w:pPr>
+      <w:r>
+        <w:rPr>
+          <w:b w:val="0"/>
+          <w:sz w:val="20"/>
+        </w:rPr>
+        <w:t>Converges if data is linearly separable. Does nothing if prediction already correct.</w:t>
+      </w:r>
+    </w:p>
+    <w:p>
+      <w:pPr>
+        <w:spacing w:after="0"/>
+      </w:pPr>
+    </w:p>
+    <w:p>
+      <w:pPr>
+        <w:pStyle w:val="Heading2"/>
+      </w:pPr>
+      <w:r>
+        <w:rPr>
+          <w:color w:val="2E74B5"/>
+        </w:rPr>
+        <w:t>MLP Backpropagation (the big one)</w:t>
+      </w:r>
+    </w:p>
+    <w:p>
+      <w:pPr>
+        <w:spacing w:after="40"/>
+        <w:ind w:left="0"/>
+      </w:pPr>
+      <w:r>
+        <w:rPr>
+          <w:b w:val="0"/>
+          <w:sz w:val="20"/>
+        </w:rPr>
+        <w:t>Stack layers of neurons: input -&gt; hidden -&gt; output. Train with backprop:</w:t>
+      </w:r>
+    </w:p>
+    <w:tbl>
+      <w:tblPr>
+        <w:tblStyle w:val="TableGrid"/>
+        <w:tblW w:type="auto" w:w="0"/>
+        <w:tblLook w:firstColumn="1" w:firstRow="1" w:lastColumn="0" w:lastRow="0" w:noHBand="0" w:noVBand="1" w:val="04A0"/>
+      </w:tblPr>
+      <w:tblGrid>
+        <w:gridCol w:w="3324"/>
+        <w:gridCol w:w="3324"/>
+        <w:gridCol w:w="3324"/>
+      </w:tblGrid>
+      <w:tr>
+        <w:tc>
+          <w:tcPr>
+            <w:tcW w:type="dxa" w:w="1872"/>
+            <w:shd w:fill="D6E4F0" w:val="clear"/>
+          </w:tcPr>
+          <w:p>
+            <w:r>
+              <w:rPr>
+                <w:b/>
+                <w:sz w:val="18"/>
+              </w:rPr>
+              <w:t>Step</w:t>
+            </w:r>
+          </w:p>
+        </w:tc>
+        <w:tc>
+          <w:tcPr>
+            <w:tcW w:type="dxa" w:w="3600"/>
+            <w:shd w:fill="D6E4F0" w:val="clear"/>
+          </w:tcPr>
+          <w:p>
+            <w:r>
+              <w:rPr>
+                <w:b/>
+                <w:sz w:val="18"/>
+              </w:rPr>
+              <w:t>What happens</w:t>
+            </w:r>
+          </w:p>
+        </w:tc>
+        <w:tc>
+          <w:tcPr>
+            <w:tcW w:type="dxa" w:w="3744"/>
+            <w:shd w:fill="D6E4F0" w:val="clear"/>
+          </w:tcPr>
+          <w:p>
+            <w:r>
+              <w:rPr>
+                <w:b/>
+                <w:sz w:val="18"/>
+              </w:rPr>
+              <w:t>Formula</w:t>
+            </w:r>
+          </w:p>
+        </w:tc>
+      </w:tr>
+      <w:tr>
+        <w:tc>
+          <w:tcPr>
+            <w:tcW w:type="dxa" w:w="1872"/>
+          </w:tcPr>
+          <w:p>
+            <w:r>
+              <w:rPr>
+                <w:sz w:val="18"/>
+              </w:rPr>
+              <w:t>1. Forward pass</w:t>
+            </w:r>
+          </w:p>
+        </w:tc>
+        <w:tc>
+          <w:tcPr>
+            <w:tcW w:type="dxa" w:w="3600"/>
+          </w:tcPr>
+          <w:p>
+            <w:r>
+              <w:rPr>
+                <w:sz w:val="18"/>
+              </w:rPr>
+              <w:t>Compute each layer output left-to-right</w:t>
+            </w:r>
+          </w:p>
+        </w:tc>
+        <w:tc>
+          <w:tcPr>
+            <w:tcW w:type="dxa" w:w="3744"/>
+          </w:tcPr>
+          <w:p>
+            <w:r>
+              <w:rPr>
+                <w:sz w:val="18"/>
+              </w:rPr>
+              <w:t>o_j = sigma(sum W_ij * x_i)</w:t>
+            </w:r>
+          </w:p>
+        </w:tc>
+      </w:tr>
+      <w:tr>
+        <w:tc>
+          <w:tcPr>
+            <w:tcW w:type="dxa" w:w="1872"/>
+          </w:tcPr>
+          <w:p>
+            <w:r>
+              <w:rPr>
+                <w:sz w:val="18"/>
+              </w:rPr>
+              <w:t>2. Output delta</w:t>
+            </w:r>
+          </w:p>
+        </w:tc>
+        <w:tc>
+          <w:tcPr>
+            <w:tcW w:type="dxa" w:w="3600"/>
+          </w:tcPr>
+          <w:p>
+            <w:r>
+              <w:rPr>
+                <w:sz w:val="18"/>
+              </w:rPr>
+              <w:t>Measure how wrong the output is and how sensitive</w:t>
+            </w:r>
+          </w:p>
+        </w:tc>
+        <w:tc>
+          <w:tcPr>
+            <w:tcW w:type="dxa" w:w="3744"/>
+          </w:tcPr>
+          <w:p>
+            <w:r>
+              <w:rPr>
+                <w:sz w:val="18"/>
+              </w:rPr>
+              <w:t>delta_p = (y_p - y_hat_p)*y_hat_p*(1-y_hat_p)</w:t>
+            </w:r>
+          </w:p>
+        </w:tc>
+      </w:tr>
+      <w:tr>
+        <w:tc>
+          <w:tcPr>
+            <w:tcW w:type="dxa" w:w="1872"/>
+          </w:tcPr>
+          <w:p>
+            <w:r>
+              <w:rPr>
+                <w:sz w:val="18"/>
+              </w:rPr>
+              <w:t>3. Update output weights</w:t>
+            </w:r>
+          </w:p>
+        </w:tc>
+        <w:tc>
+          <w:tcPr>
+            <w:tcW w:type="dxa" w:w="3600"/>
+          </w:tcPr>
+          <w:p>
+            <w:r>
+              <w:rPr>
+                <w:sz w:val="18"/>
+              </w:rPr>
+              <w:t>Nudge hidden-&gt;output weights</w:t>
+            </w:r>
+          </w:p>
+        </w:tc>
+        <w:tc>
+          <w:tcPr>
+            <w:tcW w:type="dxa" w:w="3744"/>
+          </w:tcPr>
+          <w:p>
+            <w:r>
+              <w:rPr>
+                <w:sz w:val="18"/>
+              </w:rPr>
+              <w:t>W_jp_new = W_jp + eta*delta_p*o_j</w:t>
+            </w:r>
+          </w:p>
+        </w:tc>
+      </w:tr>
+      <w:tr>
+        <w:tc>
+          <w:tcPr>
+            <w:tcW w:type="dxa" w:w="1872"/>
+          </w:tcPr>
+          <w:p>
+            <w:r>
+              <w:rPr>
+                <w:sz w:val="18"/>
+              </w:rPr>
+              <w:t>4. Hidden delta</w:t>
+            </w:r>
+          </w:p>
+        </w:tc>
+        <w:tc>
+          <w:tcPr>
+            <w:tcW w:type="dxa" w:w="3600"/>
+          </w:tcPr>
+          <w:p>
+            <w:r>
+              <w:rPr>
+                <w:sz w:val="18"/>
+              </w:rPr>
+              <w:t>Propagate blame back through hidden layer</w:t>
+            </w:r>
+          </w:p>
+        </w:tc>
+        <w:tc>
+          <w:tcPr>
+            <w:tcW w:type="dxa" w:w="3744"/>
+          </w:tcPr>
+          <w:p>
+            <w:r>
+              <w:rPr>
+                <w:sz w:val="18"/>
+              </w:rPr>
+              <w:t>delta_j = o_j*(1-o_j)*sum_p(W_jp*delta_p)</w:t>
+            </w:r>
+          </w:p>
+        </w:tc>
+      </w:tr>
+      <w:tr>
+        <w:tc>
+          <w:tcPr>
+            <w:tcW w:type="dxa" w:w="1872"/>
+          </w:tcPr>
+          <w:p>
+            <w:r>
+              <w:rPr>
+                <w:sz w:val="18"/>
+              </w:rPr>
+              <w:t>5. Update hidden weights</w:t>
+            </w:r>
+          </w:p>
+        </w:tc>
+        <w:tc>
+          <w:tcPr>
+            <w:tcW w:type="dxa" w:w="3600"/>
+          </w:tcPr>
+          <w:p>
+            <w:r>
+              <w:rPr>
+                <w:sz w:val="18"/>
+              </w:rPr>
+              <w:t>Nudge input-&gt;hidden weights</w:t>
+            </w:r>
+          </w:p>
+        </w:tc>
+        <w:tc>
+          <w:tcPr>
+            <w:tcW w:type="dxa" w:w="3744"/>
+          </w:tcPr>
+          <w:p>
+            <w:r>
+              <w:rPr>
+                <w:sz w:val="18"/>
+              </w:rPr>
+              <w:t>W_ij_new = W_ij + eta*delta_j*x_i</w:t>
+            </w:r>
+          </w:p>
+        </w:tc>
+      </w:tr>
+    </w:tbl>
+    <w:p>
+      <w:pPr>
+        <w:spacing w:after="0"/>
+      </w:pPr>
+    </w:p>
+    <w:p>
+      <w:pPr>
+        <w:spacing w:after="40"/>
+        <w:ind w:left="240"/>
+      </w:pPr>
+      <w:r>
+        <w:rPr>
+          <w:b/>
+          <w:color w:val="C05500"/>
+          <w:sz w:val="20"/>
+        </w:rPr>
+        <w:t xml:space="preserve">EXAM TIP: </w:t>
+      </w:r>
+      <w:r>
+        <w:rPr>
+          <w:color w:val="C05500"/>
+          <w:sz w:val="20"/>
+        </w:rPr>
+        <w:t>Remember: output delta uses (y - y_hat). Hidden delta uses sum of weighted output deltas. Both multiplied by o*(1-o).</w:t>
+      </w:r>
+    </w:p>
+    <w:p>
+      <w:pPr>
+        <w:spacing w:after="0"/>
+      </w:pPr>
+    </w:p>
+    <w:p>
+      <w:pPr>
+        <w:pStyle w:val="Heading2"/>
+      </w:pPr>
+      <w:r>
+        <w:rPr>
+          <w:color w:val="2E74B5"/>
+        </w:rPr>
+        <w:t>Gradient Descent Variants</w:t>
+      </w:r>
+    </w:p>
+    <w:tbl>
+      <w:tblPr>
+        <w:tblStyle w:val="TableGrid"/>
+        <w:tblW w:type="auto" w:w="0"/>
+        <w:tblLook w:firstColumn="1" w:firstRow="1" w:lastColumn="0" w:lastRow="0" w:noHBand="0" w:noVBand="1" w:val="04A0"/>
+      </w:tblPr>
+      <w:tblGrid>
+        <w:gridCol w:w="3324"/>
+        <w:gridCol w:w="3324"/>
+        <w:gridCol w:w="3324"/>
+      </w:tblGrid>
+      <w:tr>
+        <w:tc>
+          <w:tcPr>
+            <w:tcW w:type="dxa" w:w="2160"/>
+            <w:shd w:fill="D6E4F0" w:val="clear"/>
+          </w:tcPr>
+          <w:p>
+            <w:r>
+              <w:rPr>
+                <w:b/>
+                <w:sz w:val="18"/>
+              </w:rPr>
+              <w:t>Variant</w:t>
+            </w:r>
+          </w:p>
+        </w:tc>
+        <w:tc>
+          <w:tcPr>
+            <w:tcW w:type="dxa" w:w="2880"/>
+            <w:shd w:fill="D6E4F0" w:val="clear"/>
+          </w:tcPr>
+          <w:p>
+            <w:r>
+              <w:rPr>
+                <w:b/>
+                <w:sz w:val="18"/>
+              </w:rPr>
+              <w:t>Update after…</w:t>
+            </w:r>
+          </w:p>
+        </w:tc>
+        <w:tc>
+          <w:tcPr>
+            <w:tcW w:type="dxa" w:w="4320"/>
+            <w:shd w:fill="D6E4F0" w:val="clear"/>
+          </w:tcPr>
+          <w:p>
+            <w:r>
+              <w:rPr>
+                <w:b/>
+                <w:sz w:val="18"/>
+              </w:rPr>
+              <w:t>Tradeoff</w:t>
+            </w:r>
+          </w:p>
+        </w:tc>
+      </w:tr>
+      <w:tr>
+        <w:tc>
+          <w:tcPr>
+            <w:tcW w:type="dxa" w:w="2160"/>
+          </w:tcPr>
+          <w:p>
+            <w:r>
+              <w:rPr>
+                <w:sz w:val="18"/>
+              </w:rPr>
+              <w:t>Batch GD</w:t>
+            </w:r>
+          </w:p>
+        </w:tc>
+        <w:tc>
+          <w:tcPr>
+            <w:tcW w:type="dxa" w:w="2880"/>
+          </w:tcPr>
+          <w:p>
+            <w:r>
+              <w:rPr>
+                <w:sz w:val="18"/>
+              </w:rPr>
+              <w:t>All N training examples</w:t>
+            </w:r>
+          </w:p>
+        </w:tc>
+        <w:tc>
+          <w:tcPr>
+            <w:tcW w:type="dxa" w:w="4320"/>
+          </w:tcPr>
+          <w:p>
+            <w:r>
+              <w:rPr>
+                <w:sz w:val="18"/>
+              </w:rPr>
+              <w:t>Stable but slow; one update per epoch</w:t>
+            </w:r>
+          </w:p>
+        </w:tc>
+      </w:tr>
+      <w:tr>
+        <w:tc>
+          <w:tcPr>
+            <w:tcW w:type="dxa" w:w="2160"/>
+          </w:tcPr>
+          <w:p>
+            <w:r>
+              <w:rPr>
+                <w:sz w:val="18"/>
+              </w:rPr>
+              <w:t>Stochastic GD</w:t>
+            </w:r>
+          </w:p>
+        </w:tc>
+        <w:tc>
+          <w:tcPr>
+            <w:tcW w:type="dxa" w:w="2880"/>
+          </w:tcPr>
+          <w:p>
+            <w:r>
+              <w:rPr>
+                <w:sz w:val="18"/>
+              </w:rPr>
+              <w:t>Every single example</w:t>
+            </w:r>
+          </w:p>
+        </w:tc>
+        <w:tc>
+          <w:tcPr>
+            <w:tcW w:type="dxa" w:w="4320"/>
+          </w:tcPr>
+          <w:p>
+            <w:r>
+              <w:rPr>
+                <w:sz w:val="18"/>
+              </w:rPr>
+              <w:t>Fast but noisy updates</w:t>
+            </w:r>
+          </w:p>
+        </w:tc>
+      </w:tr>
+      <w:tr>
+        <w:tc>
+          <w:tcPr>
+            <w:tcW w:type="dxa" w:w="2160"/>
+          </w:tcPr>
+          <w:p>
+            <w:r>
+              <w:rPr>
+                <w:sz w:val="18"/>
+              </w:rPr>
+              <w:t>Mini-batch GD</w:t>
+            </w:r>
+          </w:p>
+        </w:tc>
+        <w:tc>
+          <w:tcPr>
+            <w:tcW w:type="dxa" w:w="2880"/>
+          </w:tcPr>
+          <w:p>
+            <w:r>
+              <w:rPr>
+                <w:sz w:val="18"/>
+              </w:rPr>
+              <w:t>Every B examples (e.g. B=50)</w:t>
+            </w:r>
+          </w:p>
+        </w:tc>
+        <w:tc>
+          <w:tcPr>
+            <w:tcW w:type="dxa" w:w="4320"/>
+          </w:tcPr>
+          <w:p>
+            <w:r>
+              <w:rPr>
+                <w:sz w:val="18"/>
+              </w:rPr>
+              <w:t>Best of both: stable and reasonably fast</w:t>
+            </w:r>
+          </w:p>
+        </w:tc>
+      </w:tr>
+    </w:tbl>
+    <w:p>
+      <w:pPr>
+        <w:spacing w:after="0"/>
+      </w:pPr>
+    </w:p>
+    <w:p>
+      <w:pPr>
+        <w:spacing w:after="40"/>
+        <w:ind w:left="240"/>
+      </w:pPr>
+      <w:r>
+        <w:rPr>
+          <w:b w:val="0"/>
+          <w:sz w:val="20"/>
+        </w:rPr>
+        <w:t>Mini-batch iterations per epoch = N / B. Total iterations = (N/B) * epochs.</w:t>
+      </w:r>
+    </w:p>
+    <w:p>
+      <w:pPr>
+        <w:spacing w:after="0"/>
+      </w:pPr>
+    </w:p>
+    <w:p>
+      <w:pPr>
+        <w:pStyle w:val="Heading1"/>
+      </w:pPr>
+      <w:r>
+        <w:rPr>
+          <w:color w:val="1F497D"/>
+        </w:rPr>
+        <w:t>L08 — Deep Learning</w:t>
+      </w:r>
+    </w:p>
+    <w:p>
+      <w:pPr>
+        <w:pStyle w:val="Heading2"/>
+      </w:pPr>
+      <w:r>
+        <w:rPr>
+          <w:color w:val="2E74B5"/>
+        </w:rPr>
+        <w:t>CNN — Convolutional Neural Network</w:t>
+      </w:r>
+    </w:p>
+    <w:p>
+      <w:pPr>
+        <w:spacing w:after="40"/>
+        <w:ind w:left="0"/>
+      </w:pPr>
+      <w:r>
+        <w:rPr>
+          <w:b w:val="0"/>
+          <w:sz w:val="20"/>
+        </w:rPr>
+        <w:t>For images. Three layer types:</w:t>
+      </w:r>
+    </w:p>
+    <w:tbl>
+      <w:tblPr>
+        <w:tblStyle w:val="TableGrid"/>
+        <w:tblW w:type="auto" w:w="0"/>
+        <w:tblLook w:firstColumn="1" w:firstRow="1" w:lastColumn="0" w:lastRow="0" w:noHBand="0" w:noVBand="1" w:val="04A0"/>
+      </w:tblPr>
+      <w:tblGrid>
+        <w:gridCol w:w="3324"/>
+        <w:gridCol w:w="3324"/>
+        <w:gridCol w:w="3324"/>
+      </w:tblGrid>
+      <w:tr>
+        <w:tc>
+          <w:tcPr>
+            <w:tcW w:type="dxa" w:w="2160"/>
+            <w:shd w:fill="D6E4F0" w:val="clear"/>
+          </w:tcPr>
+          <w:p>
+            <w:r>
+              <w:rPr>
+                <w:b/>
+                <w:sz w:val="18"/>
+              </w:rPr>
+              <w:t>Layer</w:t>
+            </w:r>
+          </w:p>
+        </w:tc>
+        <w:tc>
+          <w:tcPr>
+            <w:tcW w:type="dxa" w:w="4320"/>
+            <w:shd w:fill="D6E4F0" w:val="clear"/>
+          </w:tcPr>
+          <w:p>
+            <w:r>
+              <w:rPr>
+                <w:b/>
+                <w:sz w:val="18"/>
+              </w:rPr>
+              <w:t>Plain English</w:t>
+            </w:r>
+          </w:p>
+        </w:tc>
+        <w:tc>
+          <w:tcPr>
+            <w:tcW w:type="dxa" w:w="2880"/>
+            <w:shd w:fill="D6E4F0" w:val="clear"/>
+          </w:tcPr>
+          <w:p>
+            <w:r>
+              <w:rPr>
+                <w:b/>
+                <w:sz w:val="18"/>
+              </w:rPr>
+              <w:t>Key formula</w:t>
+            </w:r>
+          </w:p>
+        </w:tc>
+      </w:tr>
+      <w:tr>
+        <w:tc>
+          <w:tcPr>
+            <w:tcW w:type="dxa" w:w="2160"/>
+          </w:tcPr>
+          <w:p>
+            <w:r>
+              <w:rPr>
+                <w:sz w:val="18"/>
+              </w:rPr>
+              <w:t>Convolutional</w:t>
+            </w:r>
+          </w:p>
+        </w:tc>
+        <w:tc>
+          <w:tcPr>
+            <w:tcW w:type="dxa" w:w="4320"/>
+          </w:tcPr>
+          <w:p>
+            <w:r>
+              <w:rPr>
+                <w:sz w:val="18"/>
+              </w:rPr>
+              <w:t>Slide a small filter over the image. Each position: multiply element-wise and sum. Detects edges and textures.</w:t>
+            </w:r>
+          </w:p>
+        </w:tc>
+        <w:tc>
+          <w:tcPr>
+            <w:tcW w:type="dxa" w:w="2880"/>
+          </w:tcPr>
+          <w:p>
+            <w:r>
+              <w:rPr>
+                <w:sz w:val="18"/>
+              </w:rPr>
+              <w:t>Output size = (img - kernel)/stride + 1</w:t>
+            </w:r>
+          </w:p>
+        </w:tc>
+      </w:tr>
+      <w:tr>
+        <w:tc>
+          <w:tcPr>
+            <w:tcW w:type="dxa" w:w="2160"/>
+          </w:tcPr>
+          <w:p>
+            <w:r>
+              <w:rPr>
+                <w:sz w:val="18"/>
+              </w:rPr>
+              <w:t>Pooling</w:t>
+            </w:r>
+          </w:p>
+        </w:tc>
+        <w:tc>
+          <w:tcPr>
+            <w:tcW w:type="dxa" w:w="4320"/>
+          </w:tcPr>
+          <w:p>
+            <w:r>
+              <w:rPr>
+                <w:sz w:val="18"/>
+              </w:rPr>
+              <w:t>Shrink the image (e.g. take max in each 2x2 block). Makes the network not care exactly where a feature is.</w:t>
+            </w:r>
+          </w:p>
+        </w:tc>
+        <w:tc>
+          <w:tcPr>
+            <w:tcW w:type="dxa" w:w="2880"/>
+          </w:tcPr>
+          <w:p>
+            <w:r>
+              <w:rPr>
+                <w:sz w:val="18"/>
+              </w:rPr>
+              <w:t>Max-pooling: take max in each region</w:t>
+            </w:r>
+          </w:p>
+        </w:tc>
+      </w:tr>
+      <w:tr>
+        <w:tc>
+          <w:tcPr>
+            <w:tcW w:type="dxa" w:w="2160"/>
+          </w:tcPr>
+          <w:p>
+            <w:r>
+              <w:rPr>
+                <w:sz w:val="18"/>
+              </w:rPr>
+              <w:t>Fully Connected</w:t>
+            </w:r>
+          </w:p>
+        </w:tc>
+        <w:tc>
+          <w:tcPr>
+            <w:tcW w:type="dxa" w:w="4320"/>
+          </w:tcPr>
+          <w:p>
+            <w:r>
+              <w:rPr>
+                <w:sz w:val="18"/>
+              </w:rPr>
+              <w:t>Flatten everything, then classic MLP to produce final class scores.</w:t>
+            </w:r>
+          </w:p>
+        </w:tc>
+        <w:tc>
+          <w:tcPr>
+            <w:tcW w:type="dxa" w:w="2880"/>
+          </w:tcPr>
+          <w:p>
+            <w:r>
+              <w:rPr>
+                <w:sz w:val="18"/>
+              </w:rPr>
+              <w:t>Same as MLP forward pass</w:t>
+            </w:r>
+          </w:p>
+        </w:tc>
+      </w:tr>
+    </w:tbl>
+    <w:p>
+      <w:pPr>
+        <w:spacing w:after="0"/>
+      </w:pPr>
+    </w:p>
+    <w:p>
+      <w:pPr>
+        <w:spacing w:after="40"/>
+        <w:ind w:left="240"/>
+      </w:pPr>
+      <w:r>
+        <w:rPr>
+          <w:b/>
+          <w:color w:val="C05500"/>
+          <w:sz w:val="20"/>
+        </w:rPr>
+        <w:t xml:space="preserve">EXAM TIP: </w:t>
+      </w:r>
+      <w:r>
+        <w:rPr>
+          <w:color w:val="C05500"/>
+          <w:sz w:val="20"/>
+        </w:rPr>
+        <w:t>4x4 image, 3x3 kernel, stride 1 -&gt; output is (4-3)/1+1 = 2x2. Always check output size first.</w:t>
+      </w:r>
+    </w:p>
+    <w:p>
+      <w:pPr>
+        <w:spacing w:after="0"/>
+      </w:pPr>
+    </w:p>
+    <w:p>
+      <w:pPr>
+        <w:pStyle w:val="Heading2"/>
+      </w:pPr>
+      <w:r>
+        <w:rPr>
+          <w:color w:val="2E74B5"/>
+        </w:rPr>
+        <w:t>CNN Convolution Calculation</w:t>
+      </w:r>
+    </w:p>
+    <w:p>
+      <w:pPr>
+        <w:spacing w:after="40"/>
+        <w:ind w:left="0"/>
+      </w:pPr>
+      <w:r>
+        <w:rPr>
+          <w:b w:val="0"/>
+          <w:sz w:val="20"/>
+        </w:rPr>
+        <w:t>Slide the kernel over the image patch. Multiply each overlapping pair, then sum all 9 products.</w:t>
+      </w:r>
+    </w:p>
+    <w:p>
+      <w:pPr>
+        <w:pStyle w:val="ListBullet"/>
+        <w:spacing w:after="20"/>
+        <w:ind w:left="0"/>
+      </w:pPr>
+      <w:r>
+        <w:rPr>
+          <w:sz w:val="20"/>
+        </w:rPr>
+        <w:t>Example: kernel [[1,0,-1],[1,0,-1],[1,0,-1]] on patch [[4,3,2],[1,0,1],[-1,-2,-1]]</w:t>
+      </w:r>
+    </w:p>
+    <w:p>
+      <w:pPr>
+        <w:spacing w:after="40"/>
+        <w:ind w:left="320"/>
+      </w:pPr>
+      <w:r>
+        <w:rPr>
+          <w:rFonts w:ascii="Courier New" w:hAnsi="Courier New"/>
+          <w:b/>
+          <w:sz w:val="20"/>
+        </w:rPr>
+        <w:t>= 4*1+3*0+2*(-1) + 1*1+0*0+1*(-1) + (-1)*1+(-2)*0+(-1)*(-1) = 2+0+0 = 2</w:t>
+      </w:r>
+    </w:p>
+    <w:p>
+      <w:pPr>
+        <w:spacing w:after="0"/>
+      </w:pPr>
+    </w:p>
+    <w:p>
+      <w:pPr>
+        <w:pStyle w:val="Heading2"/>
+      </w:pPr>
+      <w:r>
+        <w:rPr>
+          <w:color w:val="2E74B5"/>
+        </w:rPr>
+        <w:t>RNN — Recurrent Neural Network</w:t>
+      </w:r>
+    </w:p>
+    <w:p>
+      <w:pPr>
+        <w:spacing w:after="40"/>
+        <w:ind w:left="0"/>
+      </w:pPr>
+      <w:r>
+        <w:rPr>
+          <w:b w:val="0"/>
+          <w:sz w:val="20"/>
+        </w:rPr>
+        <w:t>Reads a sequence one element at a time (one word per step). Has a hidden state that acts as memory of what it just read.</w:t>
+      </w:r>
+    </w:p>
+    <w:p>
+      <w:pPr>
+        <w:pStyle w:val="ListBullet"/>
+        <w:spacing w:after="20"/>
+        <w:ind w:left="0"/>
+      </w:pPr>
+      <w:r>
+        <w:rPr>
+          <w:sz w:val="20"/>
+        </w:rPr>
+        <w:t>Bad at remembering things from 100 steps ago — vanishing gradient kills the signal.</w:t>
+      </w:r>
+    </w:p>
+    <w:p>
+      <w:pPr>
+        <w:spacing w:after="0"/>
+      </w:pPr>
+    </w:p>
+    <w:p>
+      <w:pPr>
+        <w:pStyle w:val="Heading2"/>
+      </w:pPr>
+      <w:r>
+        <w:rPr>
+          <w:color w:val="2E74B5"/>
+        </w:rPr>
+        <w:t>LSTM — Long Short-Term Memory</w:t>
+      </w:r>
+    </w:p>
+    <w:p>
+      <w:pPr>
+        <w:spacing w:after="40"/>
+        <w:ind w:left="0"/>
+      </w:pPr>
+      <w:r>
+        <w:rPr>
+          <w:b w:val="0"/>
+          <w:sz w:val="20"/>
+        </w:rPr>
+        <w:t>An RNN with a separate long-term memory lane (cell state) and three gates:</w:t>
+      </w:r>
+    </w:p>
+    <w:tbl>
+      <w:tblPr>
+        <w:tblStyle w:val="TableGrid"/>
+        <w:tblW w:type="auto" w:w="0"/>
+        <w:tblLook w:firstColumn="1" w:firstRow="1" w:lastColumn="0" w:lastRow="0" w:noHBand="0" w:noVBand="1" w:val="04A0"/>
+      </w:tblPr>
+      <w:tblGrid>
+        <w:gridCol w:w="4986"/>
+        <w:gridCol w:w="4986"/>
+      </w:tblGrid>
+      <w:tr>
+        <w:tc>
+          <w:tcPr>
+            <w:tcW w:type="dxa" w:w="2592"/>
+            <w:shd w:fill="D6E4F0" w:val="clear"/>
+          </w:tcPr>
+          <w:p>
+            <w:r>
+              <w:rPr>
+                <w:b/>
+                <w:sz w:val="18"/>
+              </w:rPr>
+              <w:t>Gate</w:t>
+            </w:r>
+          </w:p>
+        </w:tc>
+        <w:tc>
+          <w:tcPr>
+            <w:tcW w:type="dxa" w:w="6624"/>
+            <w:shd w:fill="D6E4F0" w:val="clear"/>
+          </w:tcPr>
+          <w:p>
+            <w:r>
+              <w:rPr>
+                <w:b/>
+                <w:sz w:val="18"/>
+              </w:rPr>
+              <w:t>Job</w:t>
+            </w:r>
+          </w:p>
+        </w:tc>
+      </w:tr>
+      <w:tr>
+        <w:tc>
+          <w:tcPr>
+            <w:tcW w:type="dxa" w:w="2592"/>
+          </w:tcPr>
+          <w:p>
+            <w:r>
+              <w:rPr>
+                <w:sz w:val="18"/>
+              </w:rPr>
+              <w:t>Forget gate</w:t>
+            </w:r>
+          </w:p>
+        </w:tc>
+        <w:tc>
+          <w:tcPr>
+            <w:tcW w:type="dxa" w:w="6624"/>
+          </w:tcPr>
+          <w:p>
+            <w:r>
+              <w:rPr>
+                <w:sz w:val="18"/>
+              </w:rPr>
+              <w:t>Decides what to erase from long-term memory</w:t>
+            </w:r>
+          </w:p>
+        </w:tc>
+      </w:tr>
+      <w:tr>
+        <w:tc>
+          <w:tcPr>
+            <w:tcW w:type="dxa" w:w="2592"/>
+          </w:tcPr>
+          <w:p>
+            <w:r>
+              <w:rPr>
+                <w:sz w:val="18"/>
+              </w:rPr>
+              <w:t>Input gate</w:t>
+            </w:r>
+          </w:p>
+        </w:tc>
+        <w:tc>
+          <w:tcPr>
+            <w:tcW w:type="dxa" w:w="6624"/>
+          </w:tcPr>
+          <w:p>
+            <w:r>
+              <w:rPr>
+                <w:sz w:val="18"/>
+              </w:rPr>
+              <w:t>Decides what new info to write into long-term memory</w:t>
+            </w:r>
+          </w:p>
+        </w:tc>
+      </w:tr>
+      <w:tr>
+        <w:tc>
+          <w:tcPr>
+            <w:tcW w:type="dxa" w:w="2592"/>
+          </w:tcPr>
+          <w:p>
+            <w:r>
+              <w:rPr>
+                <w:sz w:val="18"/>
+              </w:rPr>
+              <w:t>Output gate</w:t>
+            </w:r>
+          </w:p>
+        </w:tc>
+        <w:tc>
+          <w:tcPr>
+            <w:tcW w:type="dxa" w:w="6624"/>
+          </w:tcPr>
+          <w:p>
+            <w:r>
+              <w:rPr>
+                <w:sz w:val="18"/>
+              </w:rPr>
+              <w:t>Decides what part of memory to expose as the output</w:t>
+            </w:r>
+          </w:p>
+        </w:tc>
+      </w:tr>
+    </w:tbl>
+    <w:p>
+      <w:pPr>
+        <w:spacing w:after="0"/>
+      </w:pPr>
+    </w:p>
+    <w:p>
+      <w:pPr>
+        <w:spacing w:after="40"/>
+        <w:ind w:left="240"/>
+      </w:pPr>
+      <w:r>
+        <w:rPr>
+          <w:b w:val="0"/>
+          <w:sz w:val="20"/>
+        </w:rPr>
+        <w:t>Fixes the vanishing gradient problem. Can remember patterns from hundreds of steps ago.</w:t>
+      </w:r>
+    </w:p>
+    <w:p>
+      <w:pPr>
+        <w:spacing w:after="0"/>
+      </w:pPr>
+    </w:p>
+    <w:p>
+      <w:pPr>
+        <w:pStyle w:val="Heading2"/>
+      </w:pPr>
+      <w:r>
+        <w:rPr>
+          <w:color w:val="2E74B5"/>
+        </w:rPr>
+        <w:t>GAN — Generative Adversarial Network</w:t>
+      </w:r>
+    </w:p>
+    <w:p>
+      <w:pPr>
+        <w:spacing w:after="40"/>
+        <w:ind w:left="0"/>
+      </w:pPr>
+      <w:r>
+        <w:rPr>
+          <w:b w:val="0"/>
+          <w:sz w:val="20"/>
+        </w:rPr>
+        <w:t>Two networks fight each other:</w:t>
+      </w:r>
+    </w:p>
+    <w:tbl>
+      <w:tblPr>
+        <w:tblStyle w:val="TableGrid"/>
+        <w:tblW w:type="auto" w:w="0"/>
+        <w:tblLook w:firstColumn="1" w:firstRow="1" w:lastColumn="0" w:lastRow="0" w:noHBand="0" w:noVBand="1" w:val="04A0"/>
+      </w:tblPr>
+      <w:tblGrid>
+        <w:gridCol w:w="3324"/>
+        <w:gridCol w:w="3324"/>
+        <w:gridCol w:w="3324"/>
+      </w:tblGrid>
+      <w:tr>
+        <w:tc>
+          <w:tcPr>
+            <w:tcW w:type="dxa" w:w="2592"/>
+            <w:shd w:fill="D6E4F0" w:val="clear"/>
+          </w:tcPr>
+          <w:p>
+            <w:r>
+              <w:rPr>
+                <w:b/>
+                <w:sz w:val="18"/>
+              </w:rPr>
+              <w:t>Network</w:t>
+            </w:r>
+          </w:p>
+        </w:tc>
+        <w:tc>
+          <w:tcPr>
+            <w:tcW w:type="dxa" w:w="4032"/>
+            <w:shd w:fill="D6E4F0" w:val="clear"/>
+          </w:tcPr>
+          <w:p>
+            <w:r>
+              <w:rPr>
+                <w:b/>
+                <w:sz w:val="18"/>
+              </w:rPr>
+              <w:t>Role</w:t>
+            </w:r>
+          </w:p>
+        </w:tc>
+        <w:tc>
+          <w:tcPr>
+            <w:tcW w:type="dxa" w:w="2880"/>
+            <w:shd w:fill="D6E4F0" w:val="clear"/>
+          </w:tcPr>
+          <w:p>
+            <w:r>
+              <w:rPr>
+                <w:b/>
+                <w:sz w:val="18"/>
+              </w:rPr>
+              <w:t>Wins when…</w:t>
+            </w:r>
+          </w:p>
+        </w:tc>
+      </w:tr>
+      <w:tr>
+        <w:tc>
+          <w:tcPr>
+            <w:tcW w:type="dxa" w:w="2592"/>
+          </w:tcPr>
+          <w:p>
+            <w:r>
+              <w:rPr>
+                <w:sz w:val="18"/>
+              </w:rPr>
+              <w:t>Generator (forger)</w:t>
+            </w:r>
+          </w:p>
+        </w:tc>
+        <w:tc>
+          <w:tcPr>
+            <w:tcW w:type="dxa" w:w="4032"/>
+          </w:tcPr>
+          <w:p>
+            <w:r>
+              <w:rPr>
+                <w:sz w:val="18"/>
+              </w:rPr>
+              <w:t>Creates fake images trying to fool the discriminator</w:t>
+            </w:r>
+          </w:p>
+        </w:tc>
+        <w:tc>
+          <w:tcPr>
+            <w:tcW w:type="dxa" w:w="2880"/>
+          </w:tcPr>
+          <w:p>
+            <w:r>
+              <w:rPr>
+                <w:sz w:val="18"/>
+              </w:rPr>
+              <w:t>Discriminator cannot tell real from fake</w:t>
+            </w:r>
+          </w:p>
+        </w:tc>
+      </w:tr>
+      <w:tr>
+        <w:tc>
+          <w:tcPr>
+            <w:tcW w:type="dxa" w:w="2592"/>
+          </w:tcPr>
+          <w:p>
+            <w:r>
+              <w:rPr>
+                <w:sz w:val="18"/>
+              </w:rPr>
+              <w:t>Discriminator (detective)</w:t>
+            </w:r>
+          </w:p>
+        </w:tc>
+        <w:tc>
+          <w:tcPr>
+            <w:tcW w:type="dxa" w:w="4032"/>
+          </w:tcPr>
+          <w:p>
+            <w:r>
+              <w:rPr>
+                <w:sz w:val="18"/>
+              </w:rPr>
+              <w:t>Tries to tell real images from fakes</w:t>
+            </w:r>
+          </w:p>
+        </w:tc>
+        <w:tc>
+          <w:tcPr>
+            <w:tcW w:type="dxa" w:w="2880"/>
+          </w:tcPr>
+          <w:p>
+            <w:r>
+              <w:rPr>
+                <w:sz w:val="18"/>
+              </w:rPr>
+              <w:t>It correctly identifies all fakes</w:t>
+            </w:r>
+          </w:p>
+        </w:tc>
+      </w:tr>
+    </w:tbl>
+    <w:p>
+      <w:pPr>
+        <w:spacing w:after="0"/>
+      </w:pPr>
+    </w:p>
+    <w:p>
+      <w:pPr>
+        <w:spacing w:after="40"/>
+        <w:ind w:left="240"/>
+      </w:pPr>
+      <w:r>
+        <w:rPr>
+          <w:b w:val="0"/>
+          <w:sz w:val="20"/>
+        </w:rPr>
+        <w:t>They improve each other through competition. Equilibrium: Generator perfectly replicates reality, Discriminator outputs 0.5 (random guess).</w:t>
+      </w:r>
+    </w:p>
+    <w:p>
+      <w:pPr>
+        <w:spacing w:after="0"/>
+      </w:pPr>
+    </w:p>
+    <w:p>
+      <w:pPr>
+        <w:pStyle w:val="Heading1"/>
+      </w:pPr>
+      <w:r>
+        <w:rPr>
+          <w:color w:val="1F497D"/>
+        </w:rPr>
+        <w:t>L09 — Bayesian Networks and Naive Bayes</w:t>
+      </w:r>
+    </w:p>
+    <w:p>
+      <w:pPr>
+        <w:pStyle w:val="Heading2"/>
+      </w:pPr>
+      <w:r>
+        <w:rPr>
+          <w:color w:val="2E74B5"/>
+        </w:rPr>
+        <w:t>Probability Basics</w:t>
+      </w:r>
+    </w:p>
+    <w:tbl>
+      <w:tblPr>
+        <w:tblStyle w:val="TableGrid"/>
+        <w:tblW w:type="auto" w:w="0"/>
+        <w:tblLook w:firstColumn="1" w:firstRow="1" w:lastColumn="0" w:lastRow="0" w:noHBand="0" w:noVBand="1" w:val="04A0"/>
+      </w:tblPr>
+      <w:tblGrid>
+        <w:gridCol w:w="3324"/>
+        <w:gridCol w:w="3324"/>
+        <w:gridCol w:w="3324"/>
+      </w:tblGrid>
+      <w:tr>
+        <w:tc>
+          <w:tcPr>
+            <w:tcW w:type="dxa" w:w="1872"/>
+            <w:shd w:fill="D6E4F0" w:val="clear"/>
+          </w:tcPr>
+          <w:p>
+            <w:r>
+              <w:rPr>
+                <w:b/>
+                <w:sz w:val="18"/>
+              </w:rPr>
+              <w:t>Term</w:t>
+            </w:r>
+          </w:p>
+        </w:tc>
+        <w:tc>
+          <w:tcPr>
+            <w:tcW w:type="dxa" w:w="5040"/>
+            <w:shd w:fill="D6E4F0" w:val="clear"/>
+          </w:tcPr>
+          <w:p>
+            <w:r>
+              <w:rPr>
+                <w:b/>
+                <w:sz w:val="18"/>
+              </w:rPr>
+              <w:t>Plain English</w:t>
+            </w:r>
+          </w:p>
+        </w:tc>
+        <w:tc>
+          <w:tcPr>
+            <w:tcW w:type="dxa" w:w="2304"/>
+            <w:shd w:fill="D6E4F0" w:val="clear"/>
+          </w:tcPr>
+          <w:p>
+            <w:r>
+              <w:rPr>
+                <w:b/>
+                <w:sz w:val="18"/>
+              </w:rPr>
+              <w:t>Symbol</w:t>
+            </w:r>
+          </w:p>
+        </w:tc>
+      </w:tr>
+      <w:tr>
+        <w:tc>
+          <w:tcPr>
+            <w:tcW w:type="dxa" w:w="1872"/>
+          </w:tcPr>
+          <w:p>
+            <w:r>
+              <w:rPr>
+                <w:sz w:val="18"/>
+              </w:rPr>
+              <w:t>Prior</w:t>
+            </w:r>
+          </w:p>
+        </w:tc>
+        <w:tc>
+          <w:tcPr>
+            <w:tcW w:type="dxa" w:w="5040"/>
+          </w:tcPr>
+          <w:p>
+            <w:r>
+              <w:rPr>
+                <w:sz w:val="18"/>
+              </w:rPr>
+              <w:t>What you believe before seeing evidence</w:t>
+            </w:r>
+          </w:p>
+        </w:tc>
+        <w:tc>
+          <w:tcPr>
+            <w:tcW w:type="dxa" w:w="2304"/>
+          </w:tcPr>
+          <w:p>
+            <w:r>
+              <w:rPr>
+                <w:sz w:val="18"/>
+              </w:rPr>
+              <w:t>P(H)</w:t>
+            </w:r>
+          </w:p>
+        </w:tc>
+      </w:tr>
+      <w:tr>
+        <w:tc>
+          <w:tcPr>
+            <w:tcW w:type="dxa" w:w="1872"/>
+          </w:tcPr>
+          <w:p>
+            <w:r>
+              <w:rPr>
+                <w:sz w:val="18"/>
+              </w:rPr>
+              <w:t>Likelihood</w:t>
+            </w:r>
+          </w:p>
+        </w:tc>
+        <w:tc>
+          <w:tcPr>
+            <w:tcW w:type="dxa" w:w="5040"/>
+          </w:tcPr>
+          <w:p>
+            <w:r>
+              <w:rPr>
+                <w:sz w:val="18"/>
+              </w:rPr>
+              <w:t>How likely is the evidence given the hypothesis</w:t>
+            </w:r>
+          </w:p>
+        </w:tc>
+        <w:tc>
+          <w:tcPr>
+            <w:tcW w:type="dxa" w:w="2304"/>
+          </w:tcPr>
+          <w:p>
+            <w:r>
+              <w:rPr>
+                <w:sz w:val="18"/>
+              </w:rPr>
+              <w:t>P(E|H)</w:t>
+            </w:r>
+          </w:p>
+        </w:tc>
+      </w:tr>
+      <w:tr>
+        <w:tc>
+          <w:tcPr>
+            <w:tcW w:type="dxa" w:w="1872"/>
+          </w:tcPr>
+          <w:p>
+            <w:r>
+              <w:rPr>
+                <w:sz w:val="18"/>
+              </w:rPr>
+              <w:t>Posterior</w:t>
+            </w:r>
+          </w:p>
+        </w:tc>
+        <w:tc>
+          <w:tcPr>
+            <w:tcW w:type="dxa" w:w="5040"/>
+          </w:tcPr>
+          <w:p>
+            <w:r>
+              <w:rPr>
+                <w:sz w:val="18"/>
+              </w:rPr>
+              <w:t>What you believe after seeing evidence</w:t>
+            </w:r>
+          </w:p>
+        </w:tc>
+        <w:tc>
+          <w:tcPr>
+            <w:tcW w:type="dxa" w:w="2304"/>
+          </w:tcPr>
+          <w:p>
+            <w:r>
+              <w:rPr>
+                <w:sz w:val="18"/>
+              </w:rPr>
+              <w:t>P(H|E)</w:t>
+            </w:r>
+          </w:p>
+        </w:tc>
+      </w:tr>
+    </w:tbl>
+    <w:p>
+      <w:pPr>
+        <w:spacing w:after="0"/>
+      </w:pPr>
+    </w:p>
+    <w:p>
+      <w:pPr>
+        <w:spacing w:after="40"/>
+        <w:ind w:left="320"/>
+      </w:pPr>
+      <w:r>
+        <w:rPr>
+          <w:rFonts w:ascii="Courier New" w:hAnsi="Courier New"/>
+          <w:b/>
+          <w:sz w:val="20"/>
+        </w:rPr>
+        <w:t>Bayes Rule: P(H|E) = P(E|H) * P(H) / P(E)</w:t>
+      </w:r>
+    </w:p>
+    <w:p>
+      <w:pPr>
+        <w:spacing w:after="0"/>
+      </w:pPr>
+    </w:p>
+    <w:p>
+      <w:pPr>
+        <w:pStyle w:val="Heading2"/>
+      </w:pPr>
+      <w:r>
+        <w:rPr>
+          <w:color w:val="2E74B5"/>
+        </w:rPr>
+        <w:t>Bayesian Network</w:t>
+      </w:r>
+    </w:p>
+    <w:p>
+      <w:pPr>
+        <w:spacing w:after="40"/>
+        <w:ind w:left="0"/>
+      </w:pPr>
+      <w:r>
+        <w:rPr>
+          <w:b w:val="0"/>
+          <w:sz w:val="20"/>
+        </w:rPr>
+        <w:t>A graph where arrows mean cause -&gt; effect. Each node has a probability table given its parents.</w:t>
+      </w:r>
+    </w:p>
+    <w:p>
+      <w:pPr>
+        <w:pStyle w:val="ListBullet"/>
+        <w:spacing w:after="20"/>
+        <w:ind w:left="0"/>
+      </w:pPr>
+      <w:r>
+        <w:rPr>
+          <w:sz w:val="20"/>
+        </w:rPr>
+        <w:t>Predictive inference (cause -&gt; effect): It is raining, how likely is the grass wet?</w:t>
+      </w:r>
+    </w:p>
+    <w:p>
+      <w:pPr>
+        <w:pStyle w:val="ListBullet"/>
+        <w:spacing w:after="20"/>
+        <w:ind w:left="0"/>
+      </w:pPr>
+      <w:r>
+        <w:rPr>
+          <w:sz w:val="20"/>
+        </w:rPr>
+        <w:t>Diagnostic inference (effect -&gt; cause): Grass is wet, did it rain? Use Bayes rule to flip the direction.</w:t>
+      </w:r>
+    </w:p>
+    <w:p>
+      <w:pPr>
+        <w:pStyle w:val="ListBullet"/>
+        <w:spacing w:after="20"/>
+        <w:ind w:left="0"/>
+      </w:pPr>
+      <w:r>
+        <w:rPr>
+          <w:sz w:val="20"/>
+        </w:rPr>
+        <w:t>Key calculation: sum over all parent combinations. P(X) = sum over parents: P(X|parents)*P(parents).</w:t>
+      </w:r>
+    </w:p>
+    <w:p>
+      <w:pPr>
+        <w:spacing w:after="0"/>
+      </w:pPr>
+    </w:p>
+    <w:p>
+      <w:pPr>
+        <w:pStyle w:val="Heading2"/>
+      </w:pPr>
+      <w:r>
+        <w:rPr>
+          <w:color w:val="2E74B5"/>
+        </w:rPr>
+        <w:t>Naive Bayes Classifier</w:t>
+      </w:r>
+    </w:p>
+    <w:p>
+      <w:pPr>
+        <w:spacing w:after="40"/>
+        <w:ind w:left="0"/>
+      </w:pPr>
+      <w:r>
+        <w:rPr>
+          <w:b w:val="0"/>
+          <w:sz w:val="20"/>
+        </w:rPr>
+        <w:t>Classify an email as spam or not-spam. Multiply together prior and probability of each feature given the class.</w:t>
+      </w:r>
+    </w:p>
+    <w:p>
+      <w:pPr>
+        <w:spacing w:after="40"/>
+        <w:ind w:left="320"/>
+      </w:pPr>
+      <w:r>
+        <w:rPr>
+          <w:rFonts w:ascii="Courier New" w:hAnsi="Courier New"/>
+          <w:b/>
+          <w:sz w:val="20"/>
+        </w:rPr>
+        <w:t>Score(class) = P(class) * P(f1|class) * P(f2|class) * ... * P(fn|class)</w:t>
+      </w:r>
+    </w:p>
+    <w:p>
+      <w:pPr>
+        <w:spacing w:after="40"/>
+        <w:ind w:left="240"/>
+      </w:pPr>
+      <w:r>
+        <w:rPr>
+          <w:b w:val="0"/>
+          <w:sz w:val="20"/>
+        </w:rPr>
+        <w:t>Pick the class with the highest score. Naive = assumes features are independent (they are not really, but it still works surprisingly well).</w:t>
+      </w:r>
+    </w:p>
+    <w:p>
+      <w:pPr>
+        <w:spacing w:after="0"/>
+      </w:pPr>
+    </w:p>
+    <w:p>
+      <w:pPr>
+        <w:pStyle w:val="Heading1"/>
+      </w:pPr>
+      <w:r>
+        <w:rPr>
+          <w:color w:val="1F497D"/>
+        </w:rPr>
+        <w:t>Calculation Cheat Sheet — 30-Second Recipes</w:t>
+      </w:r>
+    </w:p>
+    <w:tbl>
+      <w:tblPr>
+        <w:tblStyle w:val="TableGrid"/>
+        <w:tblW w:type="auto" w:w="0"/>
+        <w:tblLook w:firstColumn="1" w:firstRow="1" w:lastColumn="0" w:lastRow="0" w:noHBand="0" w:noVBand="1" w:val="04A0"/>
+      </w:tblPr>
+      <w:tblGrid>
+        <w:gridCol w:w="4986"/>
+        <w:gridCol w:w="4986"/>
+      </w:tblGrid>
+      <w:tr>
+        <w:tc>
+          <w:tcPr>
+            <w:tcW w:type="dxa" w:w="2592"/>
+            <w:shd w:fill="D6E4F0" w:val="clear"/>
+          </w:tcPr>
+          <w:p>
+            <w:r>
+              <w:rPr>
+                <w:b/>
+                <w:sz w:val="18"/>
+              </w:rPr>
+              <w:t>Calculation</w:t>
+            </w:r>
+          </w:p>
+        </w:tc>
+        <w:tc>
+          <w:tcPr>
+            <w:tcW w:type="dxa" w:w="6912"/>
+            <w:shd w:fill="D6E4F0" w:val="clear"/>
+          </w:tcPr>
+          <w:p>
+            <w:r>
+              <w:rPr>
+                <w:b/>
+                <w:sz w:val="18"/>
+              </w:rPr>
+              <w:t>One-liner recipe</w:t>
+            </w:r>
+          </w:p>
+        </w:tc>
+      </w:tr>
+      <w:tr>
+        <w:tc>
+          <w:tcPr>
+            <w:tcW w:type="dxa" w:w="2592"/>
+          </w:tcPr>
+          <w:p>
+            <w:r>
+              <w:rPr>
+                <w:sz w:val="18"/>
+              </w:rPr>
+              <w:t>BFS</w:t>
+            </w:r>
+          </w:p>
+        </w:tc>
+        <w:tc>
+          <w:tcPr>
+            <w:tcW w:type="dxa" w:w="6912"/>
+          </w:tcPr>
+          <w:p>
+            <w:r>
+              <w:rPr>
+                <w:sz w:val="18"/>
+              </w:rPr>
+              <w:t>FIFO queue. Add unvisited neighbours alphabetically. Ignore costs. Fewest hops.</w:t>
+            </w:r>
+          </w:p>
+        </w:tc>
+      </w:tr>
+      <w:tr>
+        <w:tc>
+          <w:tcPr>
+            <w:tcW w:type="dxa" w:w="2592"/>
+          </w:tcPr>
+          <w:p>
+            <w:r>
+              <w:rPr>
+                <w:sz w:val="18"/>
+              </w:rPr>
+              <w:t>DFS</w:t>
+            </w:r>
+          </w:p>
+        </w:tc>
+        <w:tc>
+          <w:tcPr>
+            <w:tcW w:type="dxa" w:w="6912"/>
+          </w:tcPr>
+          <w:p>
+            <w:r>
+              <w:rPr>
+                <w:sz w:val="18"/>
+              </w:rPr>
+              <w:t>Stack (go deep). Alphabetical. Ignore costs. Not optimal.</w:t>
+            </w:r>
+          </w:p>
+        </w:tc>
+      </w:tr>
+      <w:tr>
+        <w:tc>
+          <w:tcPr>
+            <w:tcW w:type="dxa" w:w="2592"/>
+          </w:tcPr>
+          <w:p>
+            <w:r>
+              <w:rPr>
+                <w:sz w:val="18"/>
+              </w:rPr>
+              <w:t>UCS</w:t>
+            </w:r>
+          </w:p>
+        </w:tc>
+        <w:tc>
+          <w:tcPr>
+            <w:tcW w:type="dxa" w:w="6912"/>
+          </w:tcPr>
+          <w:p>
+            <w:r>
+              <w:rPr>
+                <w:sz w:val="18"/>
+              </w:rPr>
+              <w:t>Priority queue by g(n). Expand cheapest. Finds cheapest total path.</w:t>
+            </w:r>
+          </w:p>
+        </w:tc>
+      </w:tr>
+      <w:tr>
+        <w:tc>
+          <w:tcPr>
+            <w:tcW w:type="dxa" w:w="2592"/>
+          </w:tcPr>
+          <w:p>
+            <w:r>
+              <w:rPr>
+                <w:sz w:val="18"/>
+              </w:rPr>
+              <w:t>A*</w:t>
+            </w:r>
+          </w:p>
+        </w:tc>
+        <w:tc>
+          <w:tcPr>
+            <w:tcW w:type="dxa" w:w="6912"/>
+          </w:tcPr>
+          <w:p>
+            <w:r>
+              <w:rPr>
+                <w:sz w:val="18"/>
+              </w:rPr>
+              <w:t>Priority queue by f=g+h. Expand lowest f. Update node if cheaper path found.</w:t>
+            </w:r>
+          </w:p>
+        </w:tc>
+      </w:tr>
+      <w:tr>
+        <w:tc>
+          <w:tcPr>
+            <w:tcW w:type="dxa" w:w="2592"/>
+          </w:tcPr>
+          <w:p>
+            <w:r>
+              <w:rPr>
+                <w:sz w:val="18"/>
+              </w:rPr>
+              <w:t>K-Means</w:t>
+            </w:r>
+          </w:p>
+        </w:tc>
+        <w:tc>
+          <w:tcPr>
+            <w:tcW w:type="dxa" w:w="6912"/>
+          </w:tcPr>
+          <w:p>
+            <w:r>
+              <w:rPr>
+                <w:sz w:val="18"/>
+              </w:rPr>
+              <w:t>Assign to nearest centre -&gt; recompute centres as means -&gt; repeat until stable.</w:t>
+            </w:r>
+          </w:p>
+        </w:tc>
+      </w:tr>
+      <w:tr>
+        <w:tc>
+          <w:tcPr>
+            <w:tcW w:type="dxa" w:w="2592"/>
+          </w:tcPr>
+          <w:p>
+            <w:r>
+              <w:rPr>
+                <w:sz w:val="18"/>
+              </w:rPr>
+              <w:t>Decision Tree</w:t>
+            </w:r>
+          </w:p>
+        </w:tc>
+        <w:tc>
+          <w:tcPr>
+            <w:tcW w:type="dxa" w:w="6912"/>
+          </w:tcPr>
+          <w:p>
+            <w:r>
+              <w:rPr>
+                <w:sz w:val="18"/>
+              </w:rPr>
+              <w:t>H(S) -&gt; IG for each feature -&gt; pick highest IG -&gt; recurse on each branch.</w:t>
+            </w:r>
+          </w:p>
+        </w:tc>
+      </w:tr>
+      <w:tr>
+        <w:tc>
+          <w:tcPr>
+            <w:tcW w:type="dxa" w:w="2592"/>
+          </w:tcPr>
+          <w:p>
+            <w:r>
+              <w:rPr>
+                <w:sz w:val="18"/>
+              </w:rPr>
+              <w:t>Perceptron</w:t>
+            </w:r>
+          </w:p>
+        </w:tc>
+        <w:tc>
+          <w:tcPr>
+            <w:tcW w:type="dxa" w:w="6912"/>
+          </w:tcPr>
+          <w:p>
+            <w:r>
+              <w:rPr>
+                <w:sz w:val="18"/>
+              </w:rPr>
+              <w:t>For each point: if wrong, w += eta*(y - y_hat)*x. If right, do nothing.</w:t>
+            </w:r>
+          </w:p>
+        </w:tc>
+      </w:tr>
+      <w:tr>
+        <w:tc>
+          <w:tcPr>
+            <w:tcW w:type="dxa" w:w="2592"/>
+          </w:tcPr>
+          <w:p>
+            <w:r>
+              <w:rPr>
+                <w:sz w:val="18"/>
+              </w:rPr>
+              <w:t>MLP Backprop</w:t>
+            </w:r>
+          </w:p>
+        </w:tc>
+        <w:tc>
+          <w:tcPr>
+            <w:tcW w:type="dxa" w:w="6912"/>
+          </w:tcPr>
+          <w:p>
+            <w:r>
+              <w:rPr>
+                <w:sz w:val="18"/>
+              </w:rPr>
+              <w:t>Forward -&gt; delta_out=(y-y_hat)*y_hat*(1-y_hat) -&gt; W(1) update -&gt; delta_hidden=o*(1-o)*sum(W*delta) -&gt; W(0) update.</w:t>
+            </w:r>
+          </w:p>
+        </w:tc>
+      </w:tr>
+      <w:tr>
+        <w:tc>
+          <w:tcPr>
+            <w:tcW w:type="dxa" w:w="2592"/>
+          </w:tcPr>
+          <w:p>
+            <w:r>
+              <w:rPr>
+                <w:sz w:val="18"/>
+              </w:rPr>
+              <w:t>Naive Bayes</w:t>
+            </w:r>
+          </w:p>
+        </w:tc>
+        <w:tc>
+          <w:tcPr>
+            <w:tcW w:type="dxa" w:w="6912"/>
+          </w:tcPr>
+          <w:p>
+            <w:r>
+              <w:rPr>
+                <w:sz w:val="18"/>
+              </w:rPr>
+              <w:t>Score = prior * product of likelihoods. Pick class with highest score.</w:t>
+            </w:r>
+          </w:p>
+        </w:tc>
+      </w:tr>
+      <w:tr>
+        <w:tc>
+          <w:tcPr>
+            <w:tcW w:type="dxa" w:w="2592"/>
+          </w:tcPr>
+          <w:p>
+            <w:r>
+              <w:rPr>
+                <w:sz w:val="18"/>
+              </w:rPr>
+              <w:t>Bayesian net P(H|E)</w:t>
+            </w:r>
+          </w:p>
+        </w:tc>
+        <w:tc>
+          <w:tcPr>
+            <w:tcW w:type="dxa" w:w="6912"/>
+          </w:tcPr>
+          <w:p>
+            <w:r>
+              <w:rPr>
+                <w:sz w:val="18"/>
+              </w:rPr>
+              <w:t>P(E|H)*P(H) / P(E). Compute P(E) by summing over all hypotheses.</w:t>
+            </w:r>
+          </w:p>
+        </w:tc>
+      </w:tr>
+      <w:tr>
+        <w:tc>
+          <w:tcPr>
+            <w:tcW w:type="dxa" w:w="2592"/>
+          </w:tcPr>
+          <w:p>
+            <w:r>
+              <w:rPr>
+                <w:sz w:val="18"/>
+              </w:rPr>
+              <w:t>SA worse-move accept</w:t>
+            </w:r>
+          </w:p>
+        </w:tc>
+        <w:tc>
+          <w:tcPr>
+            <w:tcW w:type="dxa" w:w="6912"/>
+          </w:tcPr>
+          <w:p>
+            <w:r>
+              <w:rPr>
+                <w:sz w:val="18"/>
+              </w:rPr>
+              <w:t>P = e^{-|new-old|/T}. Better move: always accept (P=1).</w:t>
+            </w:r>
+          </w:p>
+        </w:tc>
+      </w:tr>
+      <w:tr>
+        <w:tc>
+          <w:tcPr>
+            <w:tcW w:type="dxa" w:w="2592"/>
+          </w:tcPr>
+          <w:p>
+            <w:r>
+              <w:rPr>
+                <w:sz w:val="18"/>
+              </w:rPr>
+              <w:t>GD single neuron</w:t>
+            </w:r>
+          </w:p>
+        </w:tc>
+        <w:tc>
+          <w:tcPr>
+            <w:tcW w:type="dxa" w:w="6912"/>
+          </w:tcPr>
+          <w:p>
+            <w:r>
+              <w:rPr>
+                <w:sz w:val="18"/>
+              </w:rPr>
+              <w:t>dE/dwi = (A-Y)*A*(1-A)*xi. Then w_new = w - rate*dE/dw.</w:t>
+            </w:r>
+          </w:p>
+        </w:tc>
+      </w:tr>
+      <w:tr>
+        <w:tc>
+          <w:tcPr>
+            <w:tcW w:type="dxa" w:w="2592"/>
+          </w:tcPr>
+          <w:p>
+            <w:r>
+              <w:rPr>
+                <w:sz w:val="18"/>
+              </w:rPr>
+              <w:t>CNN output size</w:t>
+            </w:r>
+          </w:p>
+        </w:tc>
+        <w:tc>
+          <w:tcPr>
+            <w:tcW w:type="dxa" w:w="6912"/>
+          </w:tcPr>
+          <w:p>
+            <w:r>
+              <w:rPr>
+                <w:sz w:val="18"/>
+              </w:rPr>
+              <w:t>(image_size - kernel_size) / stride + 1. E.g. 4x4 img, 3x3 kernel -&gt; 2x2.</w:t>
+            </w:r>
+          </w:p>
+        </w:tc>
+      </w:tr>
+      <w:tr>
+        <w:tc>
+          <w:tcPr>
+            <w:tcW w:type="dxa" w:w="2592"/>
+          </w:tcPr>
+          <w:p>
+            <w:r>
+              <w:rPr>
+                <w:sz w:val="18"/>
+              </w:rPr>
+              <w:t>Mini-batch iterations</w:t>
+            </w:r>
+          </w:p>
+        </w:tc>
+        <w:tc>
+          <w:tcPr>
+            <w:tcW w:type="dxa" w:w="6912"/>
+          </w:tcPr>
+          <w:p>
+            <w:r>
+              <w:rPr>
+                <w:sz w:val="18"/>
+              </w:rPr>
+              <w:t>Total = (N / batch_size) * num_epochs.</w:t>
+            </w:r>
+          </w:p>
+        </w:tc>
+      </w:tr>
+    </w:tbl>
+    <w:p>
+      <w:pPr>
+        <w:spacing w:after="0"/>
+      </w:pPr>
     </w:p>
     <w:sectPr>
       <w:pgSz w:w="12240" w:h="15840"/>

</xml_diff>